<commit_message>
Add the sample data purge and inactive platform roles to the go-live checks
</commit_message>
<xml_diff>
--- a/docs/TISPH/pack/TISPH_Data_Migration_and_Cutover.docx
+++ b/docs/TISPH/pack/TISPH_Data_Migration_and_Cutover.docx
@@ -2221,7 +2221,7 @@
             <w:b/>
             <w:noProof/>
           </w:rPr>
-          <w:t>25</w:t>
+          <w:t>26</w:t>
         </w:r>
       </w:hyperlink>
     </w:p>
@@ -2458,7 +2458,7 @@
           <w:rPr>
             <w:noProof/>
           </w:rPr>
-          <w:t>28</w:t>
+          <w:t>29</w:t>
         </w:r>
       </w:hyperlink>
     </w:p>
@@ -2495,7 +2495,7 @@
           <w:rPr>
             <w:noProof/>
           </w:rPr>
-          <w:t>28</w:t>
+          <w:t>29</w:t>
         </w:r>
       </w:hyperlink>
     </w:p>
@@ -2621,7 +2621,7 @@
             <w:b/>
             <w:noProof/>
           </w:rPr>
-          <w:t>29</w:t>
+          <w:t>30</w:t>
         </w:r>
       </w:hyperlink>
     </w:p>
@@ -2813,7 +2813,7 @@
             <w:b/>
             <w:noProof/>
           </w:rPr>
-          <w:t>33</w:t>
+          <w:t>34</w:t>
         </w:r>
       </w:hyperlink>
     </w:p>
@@ -3353,6 +3353,137 @@
           </w:p>
         </w:tc>
       </w:tr>
+      <w:tr>
+        <w:trPr>
+          <w:cantSplit/>
+        </w:trPr>
+        <w:tc>
+          <w:tcPr>
+            <w:tcW w:w="1197" w:type="dxa"/>
+          </w:tcPr>
+          <w:p>
+            <w:pPr>
+              <w:spacing w:before="40" w:after="40" w:line="240" w:lineRule="auto"/>
+            </w:pPr>
+            <w:r>
+              <w:rPr>
+                <w:rFonts w:ascii="Segoe UI" w:hAnsi="Segoe UI" w:cs="Segoe UI" w:eastAsia="Segoe UI"/>
+                <w:sz w:val="16"/>
+                <w:szCs w:val="16"/>
+              </w:rPr>
+              <w:t xml:space="preserve">10 October 2026</w:t>
+            </w:r>
+          </w:p>
+        </w:tc>
+        <w:tc>
+          <w:tcPr>
+            <w:tcW w:w="829" w:type="dxa"/>
+          </w:tcPr>
+          <w:p>
+            <w:pPr>
+              <w:spacing w:before="40" w:after="40" w:line="240" w:lineRule="auto"/>
+            </w:pPr>
+            <w:r>
+              <w:rPr>
+                <w:rFonts w:ascii="Segoe UI" w:hAnsi="Segoe UI" w:cs="Segoe UI" w:eastAsia="Segoe UI"/>
+                <w:sz w:val="16"/>
+                <w:szCs w:val="16"/>
+              </w:rPr>
+              <w:t xml:space="preserve">0.9 Draft</w:t>
+            </w:r>
+          </w:p>
+        </w:tc>
+        <w:tc>
+          <w:tcPr>
+            <w:tcW w:w="1381" w:type="dxa"/>
+          </w:tcPr>
+          <w:p>
+            <w:pPr>
+              <w:spacing w:before="40" w:after="40" w:line="240" w:lineRule="auto"/>
+            </w:pPr>
+            <w:r>
+              <w:rPr>
+                <w:rFonts w:ascii="Segoe UI" w:hAnsi="Segoe UI" w:cs="Segoe UI" w:eastAsia="Segoe UI"/>
+                <w:sz w:val="16"/>
+                <w:szCs w:val="16"/>
+              </w:rPr>
+              <w:t xml:space="preserve">iorta TechNXT</w:t>
+            </w:r>
+          </w:p>
+        </w:tc>
+        <w:tc>
+          <w:tcPr>
+            <w:tcW w:w="1565" w:type="dxa"/>
+          </w:tcPr>
+          <w:p>
+            <w:pPr>
+              <w:spacing w:before="40" w:after="40" w:line="240" w:lineRule="auto"/>
+            </w:pPr>
+            <w:r>
+              <w:rPr>
+                <w:rFonts w:ascii="Segoe UI" w:hAnsi="Segoe UI" w:cs="Segoe UI" w:eastAsia="Segoe UI"/>
+                <w:sz w:val="16"/>
+                <w:szCs w:val="16"/>
+              </w:rPr>
+              <w:t xml:space="preserve">As above</w:t>
+            </w:r>
+          </w:p>
+        </w:tc>
+        <w:tc>
+          <w:tcPr>
+            <w:tcW w:w="1381" w:type="dxa"/>
+          </w:tcPr>
+          <w:p>
+            <w:pPr>
+              <w:spacing w:before="40" w:after="40" w:line="240" w:lineRule="auto"/>
+            </w:pPr>
+            <w:r>
+              <w:rPr>
+                <w:rFonts w:ascii="Segoe UI" w:hAnsi="Segoe UI" w:cs="Segoe UI" w:eastAsia="Segoe UI"/>
+                <w:sz w:val="16"/>
+                <w:szCs w:val="16"/>
+              </w:rPr>
+              <w:t xml:space="preserve">As above</w:t>
+            </w:r>
+          </w:p>
+        </w:tc>
+        <w:tc>
+          <w:tcPr>
+            <w:tcW w:w="2674" w:type="dxa"/>
+          </w:tcPr>
+          <w:p>
+            <w:pPr>
+              <w:spacing w:before="40" w:after="40" w:line="240" w:lineRule="auto"/>
+            </w:pPr>
+            <w:r>
+              <w:rPr>
+                <w:rFonts w:ascii="Segoe UI" w:hAnsi="Segoe UI" w:cs="Segoe UI" w:eastAsia="Segoe UI"/>
+                <w:sz w:val="16"/>
+                <w:szCs w:val="16"/>
+              </w:rPr>
+              <w:t xml:space="preserve">Go-live checks: sample data purged before go-live (section 12 step 1, criterion G7); the platform roles nobody holds inactive with </w:t>
+            </w:r>
+            <w:r>
+              <w:rPr>
+                <w:rFonts w:ascii="Consolas" w:hAnsi="Consolas" w:cs="Consolas" w:eastAsia="Consolas"/>
+                <w:color w:val="1F3B57"/>
+                <w:sz w:val="14"/>
+                <w:szCs w:val="14"/>
+                <w:shd w:val="clear" w:color="auto" w:fill="F3F5F8"/>
+              </w:rPr>
+              <w:t xml:space="preserve">tis-superid</w:t>
+            </w:r>
+            <w:r>
+              <w:rPr>
+                <w:rFonts w:ascii="Segoe UI" w:hAnsi="Segoe UI" w:cs="Segoe UI" w:eastAsia="Segoe UI"/>
+                <w:sz w:val="16"/>
+                <w:szCs w:val="16"/>
+              </w:rPr>
+              <w:t xml:space="preserve"> (G7).</w:t>
+            </w:r>
+          </w:p>
+        </w:tc>
+      </w:tr>
     </w:tbl>
     <w:p xmlns:a="http://schemas.openxmlformats.org/drawingml/2006/main" xmlns:pic="http://schemas.openxmlformats.org/drawingml/2006/picture">
       <w:pPr>
@@ -21772,7 +21903,25 @@
                 <w:sz w:val="16"/>
                 <w:szCs w:val="16"/>
               </w:rPr>
-              <w:t xml:space="preserve"> in the Azure configuration), backups running, a restore tested (DR drill of </w:t>
+              <w:t xml:space="preserve"> in the Azure configuration; an environment once seeded with sample data is cleared with </w:t>
+            </w:r>
+            <w:r>
+              <w:rPr>
+                <w:rFonts w:ascii="Consolas" w:hAnsi="Consolas" w:cs="Consolas" w:eastAsia="Consolas"/>
+                <w:color w:val="1F3B57"/>
+                <w:sz w:val="14"/>
+                <w:szCs w:val="14"/>
+                <w:shd w:val="clear" w:color="auto" w:fill="F3F5F8"/>
+              </w:rPr>
+              <w:t xml:space="preserve">npm run purge:sample</w:t>
+            </w:r>
+            <w:r>
+              <w:rPr>
+                <w:rFonts w:ascii="Segoe UI" w:hAnsi="Segoe UI" w:cs="Segoe UI" w:eastAsia="Segoe UI"/>
+                <w:sz w:val="16"/>
+                <w:szCs w:val="16"/>
+              </w:rPr>
+              <w:t xml:space="preserve"> and checked empty of demo records), backups running, a restore tested (DR drill of </w:t>
             </w:r>
             <w:r>
               <w:rPr>
@@ -29775,7 +29924,7 @@
                 <w:sz w:val="16"/>
                 <w:szCs w:val="16"/>
               </w:rPr>
-              <w:t xml:space="preserve">Users loaded and able to sign in; demo accounts and </w:t>
+              <w:t xml:space="preserve">Users loaded and able to sign in; sample data purged (</w:t>
             </w:r>
             <w:r>
               <w:rPr>
@@ -29785,6 +29934,24 @@
                 <w:szCs w:val="14"/>
                 <w:shd w:val="clear" w:color="auto" w:fill="F3F5F8"/>
               </w:rPr>
+              <w:t xml:space="preserve">npm run purge:sample</w:t>
+            </w:r>
+            <w:r>
+              <w:rPr>
+                <w:rFonts w:ascii="Segoe UI" w:hAnsi="Segoe UI" w:cs="Segoe UI" w:eastAsia="Segoe UI"/>
+                <w:sz w:val="16"/>
+                <w:szCs w:val="16"/>
+              </w:rPr>
+              <w:t xml:space="preserve">); demo accounts, the UAT-only </w:t>
+            </w:r>
+            <w:r>
+              <w:rPr>
+                <w:rFonts w:ascii="Consolas" w:hAnsi="Consolas" w:cs="Consolas" w:eastAsia="Consolas"/>
+                <w:color w:val="1F3B57"/>
+                <w:sz w:val="14"/>
+                <w:szCs w:val="14"/>
+                <w:shd w:val="clear" w:color="auto" w:fill="F3F5F8"/>
+              </w:rPr>
               <w:t xml:space="preserve">tis-superid</w:t>
             </w:r>
             <w:r>
@@ -29793,7 +29960,7 @@
                 <w:sz w:val="16"/>
                 <w:szCs w:val="16"/>
               </w:rPr>
-              <w:t xml:space="preserve"> inactive; password sign-in off except break-glass; second administrator available</w:t>
+              <w:t xml:space="preserve"> role and the platform roles nobody holds inactive; password sign-in off except break-glass; second administrator available</w:t>
             </w:r>
           </w:p>
         </w:tc>

</xml_diff>

<commit_message>
Document the workspace and the origin of records for users and TISPH
User manual chapter Data Migration & Go-Live rewritten and the help rebuilt, the go-live
guides describe the screens, and the migration plan states the controls as built.
</commit_message>
<xml_diff>
--- a/docs/TISPH/pack/TISPH_Data_Migration_and_Cutover.docx
+++ b/docs/TISPH/pack/TISPH_Data_Migration_and_Cutover.docx
@@ -520,7 +520,7 @@
                                 <w:bCs/>
                                 <w:color w:val="1D74BA"/>
                               </w:rPr>
-                              <w:t>0.9 Draft</w:t>
+                              <w:t>0.10 Draft</w:t>
                             </w:r>
                             <w:r>
                               <w:rPr>
@@ -2646,7 +2646,7 @@
           <w:rPr>
             <w:noProof/>
           </w:rPr>
-          <w:t xml:space="preserve">Audit coverage of the migration and its gaps</w:t>
+          <w:t xml:space="preserve">Audit coverage of the migration</w:t>
         </w:r>
         <w:r>
           <w:rPr>
@@ -2813,7 +2813,7 @@
             <w:b/>
             <w:noProof/>
           </w:rPr>
-          <w:t>33</w:t>
+          <w:t>34</w:t>
         </w:r>
       </w:hyperlink>
     </w:p>
@@ -3215,6 +3215,155 @@
         </w:tc>
       </w:tr>
       <w:tr>
+        <w:trPr>
+          <w:cantSplit/>
+        </w:trPr>
+        <w:tc>
+          <w:tcPr>
+            <w:tcW w:w="1197" w:type="dxa"/>
+          </w:tcPr>
+          <w:p>
+            <w:pPr>
+              <w:spacing w:before="40" w:after="40" w:line="240" w:lineRule="auto"/>
+            </w:pPr>
+            <w:r>
+              <w:rPr>
+                <w:rFonts w:ascii="Segoe UI" w:hAnsi="Segoe UI" w:cs="Segoe UI" w:eastAsia="Segoe UI"/>
+                <w:sz w:val="16"/>
+                <w:szCs w:val="16"/>
+              </w:rPr>
+              <w:t xml:space="preserve">10 October 2026</w:t>
+            </w:r>
+          </w:p>
+        </w:tc>
+        <w:tc>
+          <w:tcPr>
+            <w:tcW w:w="829" w:type="dxa"/>
+          </w:tcPr>
+          <w:p>
+            <w:pPr>
+              <w:spacing w:before="40" w:after="40" w:line="240" w:lineRule="auto"/>
+            </w:pPr>
+            <w:r>
+              <w:rPr>
+                <w:rFonts w:ascii="Segoe UI" w:hAnsi="Segoe UI" w:cs="Segoe UI" w:eastAsia="Segoe UI"/>
+                <w:sz w:val="16"/>
+                <w:szCs w:val="16"/>
+              </w:rPr>
+              <w:t xml:space="preserve">0.10 Draft</w:t>
+            </w:r>
+          </w:p>
+        </w:tc>
+        <w:tc>
+          <w:tcPr>
+            <w:tcW w:w="1381" w:type="dxa"/>
+          </w:tcPr>
+          <w:p>
+            <w:pPr>
+              <w:spacing w:before="40" w:after="40" w:line="240" w:lineRule="auto"/>
+            </w:pPr>
+            <w:r>
+              <w:rPr>
+                <w:rFonts w:ascii="Segoe UI" w:hAnsi="Segoe UI" w:cs="Segoe UI" w:eastAsia="Segoe UI"/>
+                <w:sz w:val="16"/>
+                <w:szCs w:val="16"/>
+              </w:rPr>
+              <w:t xml:space="preserve">iorta TechNXT</w:t>
+            </w:r>
+          </w:p>
+        </w:tc>
+        <w:tc>
+          <w:tcPr>
+            <w:tcW w:w="1565" w:type="dxa"/>
+          </w:tcPr>
+          <w:p>
+            <w:pPr>
+              <w:spacing w:before="40" w:after="40" w:line="240" w:lineRule="auto"/>
+            </w:pPr>
+            <w:r>
+              <w:rPr>
+                <w:rFonts w:ascii="Segoe UI" w:hAnsi="Segoe UI" w:cs="Segoe UI" w:eastAsia="Segoe UI"/>
+                <w:sz w:val="16"/>
+                <w:szCs w:val="16"/>
+              </w:rPr>
+              <w:t xml:space="preserve">As above</w:t>
+            </w:r>
+          </w:p>
+        </w:tc>
+        <w:tc>
+          <w:tcPr>
+            <w:tcW w:w="1381" w:type="dxa"/>
+          </w:tcPr>
+          <w:p>
+            <w:pPr>
+              <w:spacing w:before="40" w:after="40" w:line="240" w:lineRule="auto"/>
+            </w:pPr>
+            <w:r>
+              <w:rPr>
+                <w:rFonts w:ascii="Segoe UI" w:hAnsi="Segoe UI" w:cs="Segoe UI" w:eastAsia="Segoe UI"/>
+                <w:sz w:val="16"/>
+                <w:szCs w:val="16"/>
+              </w:rPr>
+              <w:t xml:space="preserve">As above</w:t>
+            </w:r>
+          </w:p>
+        </w:tc>
+        <w:tc>
+          <w:tcPr>
+            <w:tcW w:w="2674" w:type="dxa"/>
+          </w:tcPr>
+          <w:p>
+            <w:pPr>
+              <w:spacing w:before="40" w:after="40" w:line="240" w:lineRule="auto"/>
+            </w:pPr>
+            <w:r>
+              <w:rPr>
+                <w:rFonts w:ascii="Segoe UI" w:hAnsi="Segoe UI" w:cs="Segoe UI" w:eastAsia="Segoe UI"/>
+                <w:sz w:val="16"/>
+                <w:szCs w:val="16"/>
+              </w:rPr>
+              <w:t xml:space="preserve">Controls brought to the Data Migration &amp; Go-Live workspace as built on branch </w:t>
+            </w:r>
+            <w:r>
+              <w:rPr>
+                <w:rFonts w:ascii="Consolas" w:hAnsi="Consolas" w:cs="Consolas" w:eastAsia="Consolas"/>
+                <w:color w:val="1F3B57"/>
+                <w:sz w:val="14"/>
+                <w:szCs w:val="14"/>
+                <w:shd w:val="clear" w:color="auto" w:fill="F3F5F8"/>
+              </w:rPr>
+              <w:t xml:space="preserve">tisph/migration-workspace</w:t>
+            </w:r>
+            <w:r>
+              <w:rPr>
+                <w:rFonts w:ascii="Segoe UI" w:hAnsi="Segoe UI" w:cs="Segoe UI" w:eastAsia="Segoe UI"/>
+                <w:sz w:val="16"/>
+                <w:szCs w:val="16"/>
+              </w:rPr>
+              <w:t xml:space="preserve">: sections 20 and 20.1 describe the built controls (second-person approval of every load, per-record audit with before and after values, two-person go-live lock over every migration import, reconciliation signed in the system, evidence pack, origin of migrated records on every business screen); Q17 answered and section 21 updated. The other sections still describe the baseline </w:t>
+            </w:r>
+            <w:r>
+              <w:rPr>
+                <w:rFonts w:ascii="Consolas" w:hAnsi="Consolas" w:cs="Consolas" w:eastAsia="Consolas"/>
+                <w:color w:val="1F3B57"/>
+                <w:sz w:val="14"/>
+                <w:szCs w:val="14"/>
+                <w:shd w:val="clear" w:color="auto" w:fill="F3F5F8"/>
+              </w:rPr>
+              <w:t xml:space="preserve">58ad7702</w:t>
+            </w:r>
+            <w:r>
+              <w:rPr>
+                <w:rFonts w:ascii="Segoe UI" w:hAnsi="Segoe UI" w:cs="Segoe UI" w:eastAsia="Segoe UI"/>
+                <w:sz w:val="16"/>
+                <w:szCs w:val="16"/>
+              </w:rPr>
+              <w:t xml:space="preserve"> and are brought up to date in the next issue.</w:t>
+            </w:r>
+          </w:p>
+        </w:tc>
+      </w:tr>
+      <w:tr>
         <w:trPr/>
         <w:tc>
           <w:tcPr>
@@ -3665,7 +3814,7 @@
                 <w:sz w:val="16"/>
                 <w:szCs w:val="16"/>
               </w:rPr>
-              <w:t xml:space="preserve">0.9 Draft</w:t>
+              <w:t xml:space="preserve">0.10 Draft</w:t>
             </w:r>
           </w:p>
         </w:tc>
@@ -31979,6 +32128,59 @@
       </w:r>
       <w:bookmarkEnd w:id="1049"/>
     </w:p>
+    <w:p xmlns:a="http://schemas.openxmlformats.org/drawingml/2006/main" xmlns:pic="http://schemas.openxmlformats.org/drawingml/2006/picture">
+      <w:pPr>
+        <w:jc w:val="both"/>
+      </w:pPr>
+      <w:r>
+        <w:rPr>
+          <w:rFonts w:ascii="Segoe UI" w:hAnsi="Segoe UI" w:cs="Segoe UI" w:eastAsia="Segoe UI"/>
+        </w:rPr>
+        <w:t xml:space="preserve">The controls of this section are those of the Data Migration &amp; Go-Live workspace (Master &gt; System Configuration), built on branch </w:t>
+      </w:r>
+      <w:r>
+        <w:rPr>
+          <w:rFonts w:ascii="Consolas" w:hAnsi="Consolas" w:cs="Consolas" w:eastAsia="Consolas"/>
+          <w:color w:val="1F3B57"/>
+          <w:shd w:val="clear" w:color="auto" w:fill="F3F5F8"/>
+        </w:rPr>
+        <w:t xml:space="preserve">tisph/migration-workspace</w:t>
+      </w:r>
+      <w:r>
+        <w:rPr>
+          <w:rFonts w:ascii="Segoe UI" w:hAnsi="Segoe UI" w:cs="Segoe UI" w:eastAsia="Segoe UI"/>
+        </w:rPr>
+        <w:t xml:space="preserve"> (migrations </w:t>
+      </w:r>
+      <w:r>
+        <w:rPr>
+          <w:rFonts w:ascii="Consolas" w:hAnsi="Consolas" w:cs="Consolas" w:eastAsia="Consolas"/>
+          <w:color w:val="1F3B57"/>
+          <w:shd w:val="clear" w:color="auto" w:fill="F3F5F8"/>
+        </w:rPr>
+        <w:t xml:space="preserve">0440</w:t>
+      </w:r>
+      <w:r>
+        <w:rPr>
+          <w:rFonts w:ascii="Segoe UI" w:hAnsi="Segoe UI" w:cs="Segoe UI" w:eastAsia="Segoe UI"/>
+        </w:rPr>
+        <w:t xml:space="preserve"> to </w:t>
+      </w:r>
+      <w:r>
+        <w:rPr>
+          <w:rFonts w:ascii="Consolas" w:hAnsi="Consolas" w:cs="Consolas" w:eastAsia="Consolas"/>
+          <w:color w:val="1F3B57"/>
+          <w:shd w:val="clear" w:color="auto" w:fill="F3F5F8"/>
+        </w:rPr>
+        <w:t xml:space="preserve">0444</w:t>
+      </w:r>
+      <w:r>
+        <w:rPr>
+          <w:rFonts w:ascii="Segoe UI" w:hAnsi="Segoe UI" w:cs="Segoe UI" w:eastAsia="Segoe UI"/>
+        </w:rPr>
+        <w:t xml:space="preserve">). Sections 5 to 19 still describe the baseline and the procedures that compensated for the gaps; where they differ, this section applies.</w:t>
+      </w:r>
+    </w:p>
     <w:tbl xmlns:a="http://schemas.openxmlformats.org/drawingml/2006/main" xmlns:pic="http://schemas.openxmlformats.org/drawingml/2006/picture">
       <w:tblPr>
         <w:tblStyle w:val="TableGrid"/>
@@ -32001,9 +32203,9 @@
         <w:tblLook w:val="04A0" w:firstRow="1" w:lastRow="0" w:firstColumn="1" w:lastColumn="0" w:noHBand="0" w:noVBand="1"/>
       </w:tblPr>
       <w:tblGrid>
-        <w:gridCol w:w="3029"/>
-        <w:gridCol w:w="2816"/>
-        <w:gridCol w:w="3182"/>
+        <w:gridCol w:w="2705"/>
+        <w:gridCol w:w="3160"/>
+        <w:gridCol w:w="3162"/>
       </w:tblGrid>
       <w:tr>
         <w:trPr>
@@ -32013,7 +32215,7 @@
         </w:trPr>
         <w:tc>
           <w:tcPr>
-            <w:tcW w:w="3029" w:type="dxa"/>
+            <w:tcW w:w="2705" w:type="dxa"/>
             <w:shd w:val="clear" w:color="auto" w:fill="E8F0F8"/>
             <w:vAlign w:val="center"/>
           </w:tcPr>
@@ -32035,7 +32237,7 @@
         </w:tc>
         <w:tc>
           <w:tcPr>
-            <w:tcW w:w="2816" w:type="dxa"/>
+            <w:tcW w:w="3160" w:type="dxa"/>
             <w:shd w:val="clear" w:color="auto" w:fill="E8F0F8"/>
             <w:vAlign w:val="center"/>
           </w:tcPr>
@@ -32057,7 +32259,7 @@
         </w:tc>
         <w:tc>
           <w:tcPr>
-            <w:tcW w:w="3182" w:type="dxa"/>
+            <w:tcW w:w="3162" w:type="dxa"/>
             <w:shd w:val="clear" w:color="auto" w:fill="E8F0F8"/>
             <w:vAlign w:val="center"/>
           </w:tcPr>
@@ -32084,25 +32286,25 @@
         </w:trPr>
         <w:tc>
           <w:tcPr>
-            <w:tcW w:w="3029" w:type="dxa"/>
-          </w:tcPr>
-          <w:p>
-            <w:pPr>
-              <w:spacing w:before="40" w:after="40" w:line="240" w:lineRule="auto"/>
-            </w:pPr>
-            <w:r>
-              <w:rPr>
-                <w:rFonts w:ascii="Segoe UI" w:hAnsi="Segoe UI" w:cs="Segoe UI" w:eastAsia="Segoe UI"/>
-                <w:sz w:val="16"/>
-                <w:szCs w:val="16"/>
-              </w:rPr>
-              <w:t xml:space="preserve">Load batches (kit, file name, status, cutover date, counts per sheet, loaded counts, reconciliation, who validated and loaded, when)</w:t>
-            </w:r>
-          </w:p>
-        </w:tc>
-        <w:tc>
-          <w:tcPr>
-            <w:tcW w:w="2816" w:type="dxa"/>
+            <w:tcW w:w="2705" w:type="dxa"/>
+          </w:tcPr>
+          <w:p>
+            <w:pPr>
+              <w:spacing w:before="40" w:after="40" w:line="240" w:lineRule="auto"/>
+            </w:pPr>
+            <w:r>
+              <w:rPr>
+                <w:rFonts w:ascii="Segoe UI" w:hAnsi="Segoe UI" w:cs="Segoe UI" w:eastAsia="Segoe UI"/>
+                <w:sz w:val="16"/>
+                <w:szCs w:val="16"/>
+              </w:rPr>
+              <w:t xml:space="preserve">Loads: load number (MIG-000012, CFG-000045), kit, run, legacy system, file name and SHA-256, status from validation to load or undo, counts per result, uploader, submitter, approver, undo requester and approver, timings</w:t>
+            </w:r>
+          </w:p>
+        </w:tc>
+        <w:tc>
+          <w:tcPr>
+            <w:tcW w:w="3160" w:type="dxa"/>
           </w:tcPr>
           <w:p>
             <w:pPr>
@@ -32122,19 +32324,19 @@
         </w:tc>
         <w:tc>
           <w:tcPr>
-            <w:tcW w:w="3182" w:type="dxa"/>
-          </w:tcPr>
-          <w:p>
-            <w:pPr>
-              <w:spacing w:before="40" w:after="40" w:line="240" w:lineRule="auto"/>
-            </w:pPr>
-            <w:r>
-              <w:rPr>
-                <w:rFonts w:ascii="Segoe UI" w:hAnsi="Segoe UI" w:cs="Segoe UI" w:eastAsia="Segoe UI"/>
-                <w:sz w:val="16"/>
-                <w:szCs w:val="16"/>
-              </w:rPr>
-              <w:t xml:space="preserve">Kept in PROD after go-live. Removed with every other load record by the transaction reset (mocks, rehearsals, RB-2)</w:t>
+            <w:tcW w:w="3162" w:type="dxa"/>
+          </w:tcPr>
+          <w:p>
+            <w:pPr>
+              <w:spacing w:before="40" w:after="40" w:line="240" w:lineRule="auto"/>
+            </w:pPr>
+            <w:r>
+              <w:rPr>
+                <w:rFonts w:ascii="Segoe UI" w:hAnsi="Segoe UI" w:cs="Segoe UI" w:eastAsia="Segoe UI"/>
+                <w:sz w:val="16"/>
+                <w:szCs w:val="16"/>
+              </w:rPr>
+              <w:t xml:space="preserve">Kept in PROD; kept and marked by the transaction reset (mocks, rehearsals)</w:t>
             </w:r>
           </w:p>
         </w:tc>
@@ -32145,25 +32347,25 @@
         </w:trPr>
         <w:tc>
           <w:tcPr>
-            <w:tcW w:w="3029" w:type="dxa"/>
-          </w:tcPr>
-          <w:p>
-            <w:pPr>
-              <w:spacing w:before="40" w:after="40" w:line="240" w:lineRule="auto"/>
-            </w:pPr>
-            <w:r>
-              <w:rPr>
-                <w:rFonts w:ascii="Segoe UI" w:hAnsi="Segoe UI" w:cs="Segoe UI" w:eastAsia="Segoe UI"/>
-                <w:sz w:val="16"/>
-                <w:szCs w:val="16"/>
-              </w:rPr>
-              <w:t xml:space="preserve">Rows of a batch as read from the workbook, with their errors</w:t>
-            </w:r>
-          </w:p>
-        </w:tc>
-        <w:tc>
-          <w:tcPr>
-            <w:tcW w:w="2816" w:type="dxa"/>
+            <w:tcW w:w="2705" w:type="dxa"/>
+          </w:tcPr>
+          <w:p>
+            <w:pPr>
+              <w:spacing w:before="40" w:after="40" w:line="240" w:lineRule="auto"/>
+            </w:pPr>
+            <w:r>
+              <w:rPr>
+                <w:rFonts w:ascii="Segoe UI" w:hAnsi="Segoe UI" w:cs="Segoe UI" w:eastAsia="Segoe UI"/>
+                <w:sz w:val="16"/>
+                <w:szCs w:val="16"/>
+              </w:rPr>
+              <w:t xml:space="preserve">Rows of a load with their result (New, Changed with the changed fields, Unchanged, Duplicate, Error), the values before a change and the record created or changed; identifiers (TIN) encrypted</w:t>
+            </w:r>
+          </w:p>
+        </w:tc>
+        <w:tc>
+          <w:tcPr>
+            <w:tcW w:w="3160" w:type="dxa"/>
           </w:tcPr>
           <w:p>
             <w:pPr>
@@ -32183,19 +32385,19 @@
         </w:tc>
         <w:tc>
           <w:tcPr>
-            <w:tcW w:w="3182" w:type="dxa"/>
-          </w:tcPr>
-          <w:p>
-            <w:pPr>
-              <w:spacing w:before="40" w:after="40" w:line="240" w:lineRule="auto"/>
-            </w:pPr>
-            <w:r>
-              <w:rPr>
-                <w:rFonts w:ascii="Segoe UI" w:hAnsi="Segoe UI" w:cs="Segoe UI" w:eastAsia="Segoe UI"/>
-                <w:sz w:val="16"/>
-                <w:szCs w:val="16"/>
-              </w:rPr>
-              <w:t xml:space="preserve">Rows of loaded or failed batches deleted by housekeeping after </w:t>
+            <w:tcW w:w="3162" w:type="dxa"/>
+          </w:tcPr>
+          <w:p>
+            <w:pPr>
+              <w:spacing w:before="40" w:after="40" w:line="240" w:lineRule="auto"/>
+            </w:pPr>
+            <w:r>
+              <w:rPr>
+                <w:rFonts w:ascii="Segoe UI" w:hAnsi="Segoe UI" w:cs="Segoe UI" w:eastAsia="Segoe UI"/>
+                <w:sz w:val="16"/>
+                <w:szCs w:val="16"/>
+              </w:rPr>
+              <w:t xml:space="preserve">Rows of the production run's loads kept for the retention years; others deleted after </w:t>
             </w:r>
             <w:r>
               <w:rPr>
@@ -32213,7 +32415,7 @@
                 <w:sz w:val="16"/>
                 <w:szCs w:val="16"/>
               </w:rPr>
-              <w:t xml:space="preserve"> (default 365; 0 keeps them forever); rows of a validated batch not yet loaded are kept. Removed by the transaction reset</w:t>
+              <w:t xml:space="preserve"> (365)</w:t>
             </w:r>
           </w:p>
         </w:tc>
@@ -32224,30 +32426,56 @@
         </w:trPr>
         <w:tc>
           <w:tcPr>
-            <w:tcW w:w="3029" w:type="dxa"/>
-          </w:tcPr>
-          <w:p>
-            <w:pPr>
-              <w:spacing w:before="40" w:after="40" w:line="240" w:lineRule="auto"/>
-            </w:pPr>
-            <w:r>
-              <w:rPr>
-                <w:rFonts w:ascii="Segoe UI" w:hAnsi="Segoe UI" w:cs="Segoe UI" w:eastAsia="Segoe UI"/>
-                <w:sz w:val="16"/>
-                <w:szCs w:val="16"/>
-              </w:rPr>
-              <w:t xml:space="preserve">Environment comparisons</w:t>
-            </w:r>
-          </w:p>
-        </w:tc>
-        <w:tc>
-          <w:tcPr>
-            <w:tcW w:w="2816" w:type="dxa"/>
-          </w:tcPr>
-          <w:p>
-            <w:pPr>
-              <w:spacing w:before="40" w:after="40" w:line="240" w:lineRule="auto"/>
-            </w:pPr>
+            <w:tcW w:w="2705" w:type="dxa"/>
+          </w:tcPr>
+          <w:p>
+            <w:pPr>
+              <w:spacing w:before="40" w:after="40" w:line="240" w:lineRule="auto"/>
+            </w:pPr>
+            <w:r>
+              <w:rPr>
+                <w:rFonts w:ascii="Segoe UI" w:hAnsi="Segoe UI" w:cs="Segoe UI" w:eastAsia="Segoe UI"/>
+                <w:sz w:val="16"/>
+                <w:szCs w:val="16"/>
+              </w:rPr>
+              <w:t xml:space="preserve">The workbook as uploaded</w:t>
+            </w:r>
+          </w:p>
+        </w:tc>
+        <w:tc>
+          <w:tcPr>
+            <w:tcW w:w="3160" w:type="dxa"/>
+          </w:tcPr>
+          <w:p>
+            <w:pPr>
+              <w:spacing w:before="40" w:after="40" w:line="240" w:lineRule="auto"/>
+            </w:pPr>
+            <w:r>
+              <w:rPr>
+                <w:rFonts w:ascii="Segoe UI" w:hAnsi="Segoe UI" w:cs="Segoe UI" w:eastAsia="Segoe UI"/>
+                <w:sz w:val="16"/>
+                <w:szCs w:val="16"/>
+              </w:rPr>
+              <w:t xml:space="preserve">Encrypted storage folder, with its hash</w:t>
+            </w:r>
+          </w:p>
+        </w:tc>
+        <w:tc>
+          <w:tcPr>
+            <w:tcW w:w="3162" w:type="dxa"/>
+          </w:tcPr>
+          <w:p>
+            <w:pPr>
+              <w:spacing w:before="40" w:after="40" w:line="240" w:lineRule="auto"/>
+            </w:pPr>
+            <w:r>
+              <w:rPr>
+                <w:rFonts w:ascii="Segoe UI" w:hAnsi="Segoe UI" w:cs="Segoe UI" w:eastAsia="Segoe UI"/>
+                <w:sz w:val="16"/>
+                <w:szCs w:val="16"/>
+              </w:rPr>
+              <w:t xml:space="preserve">As the rows. Released only to holders of </w:t>
+            </w:r>
             <w:r>
               <w:rPr>
                 <w:rFonts w:ascii="Consolas" w:hAnsi="Consolas" w:cs="Consolas" w:eastAsia="Consolas"/>
@@ -32256,25 +32484,33 @@
                 <w:szCs w:val="14"/>
                 <w:shd w:val="clear" w:color="auto" w:fill="F3F5F8"/>
               </w:rPr>
-              <w:t xml:space="preserve">data_load_comparisons</w:t>
-            </w:r>
-          </w:p>
-        </w:tc>
-        <w:tc>
-          <w:tcPr>
-            <w:tcW w:w="3182" w:type="dxa"/>
-          </w:tcPr>
-          <w:p>
-            <w:pPr>
-              <w:spacing w:before="40" w:after="40" w:line="240" w:lineRule="auto"/>
-            </w:pPr>
-            <w:r>
-              <w:rPr>
-                <w:rFonts w:ascii="Segoe UI" w:hAnsi="Segoe UI" w:cs="Segoe UI" w:eastAsia="Segoe UI"/>
-                <w:sz w:val="16"/>
-                <w:szCs w:val="16"/>
-              </w:rPr>
-              <w:t xml:space="preserve">Kept; removed by the transaction reset</w:t>
+              <w:t xml:space="preserve">write:data-load</w:t>
+            </w:r>
+            <w:r>
+              <w:rPr>
+                <w:rFonts w:ascii="Segoe UI" w:hAnsi="Segoe UI" w:cs="Segoe UI" w:eastAsia="Segoe UI"/>
+                <w:sz w:val="16"/>
+                <w:szCs w:val="16"/>
+              </w:rPr>
+              <w:t xml:space="preserve"> and </w:t>
+            </w:r>
+            <w:r>
+              <w:rPr>
+                <w:rFonts w:ascii="Consolas" w:hAnsi="Consolas" w:cs="Consolas" w:eastAsia="Consolas"/>
+                <w:color w:val="1F3B57"/>
+                <w:sz w:val="14"/>
+                <w:szCs w:val="14"/>
+                <w:shd w:val="clear" w:color="auto" w:fill="F3F5F8"/>
+              </w:rPr>
+              <w:t xml:space="preserve">view:pii</w:t>
+            </w:r>
+            <w:r>
+              <w:rPr>
+                <w:rFonts w:ascii="Segoe UI" w:hAnsi="Segoe UI" w:cs="Segoe UI" w:eastAsia="Segoe UI"/>
+                <w:sz w:val="16"/>
+                <w:szCs w:val="16"/>
+              </w:rPr>
+              <w:t xml:space="preserve">; each download audited</w:t>
             </w:r>
           </w:p>
         </w:tc>
@@ -32285,30 +32521,20 @@
         </w:trPr>
         <w:tc>
           <w:tcPr>
-            <w:tcW w:w="3029" w:type="dxa"/>
-          </w:tcPr>
-          <w:p>
-            <w:pPr>
-              <w:spacing w:before="40" w:after="40" w:line="240" w:lineRule="auto"/>
-            </w:pPr>
-            <w:r>
-              <w:rPr>
-                <w:rFonts w:ascii="Segoe UI" w:hAnsi="Segoe UI" w:cs="Segoe UI" w:eastAsia="Segoe UI"/>
-                <w:sz w:val="16"/>
-                <w:szCs w:val="16"/>
-              </w:rPr>
-              <w:t xml:space="preserve">Migrated records' origin</w:t>
-            </w:r>
-          </w:p>
-        </w:tc>
-        <w:tc>
-          <w:tcPr>
-            <w:tcW w:w="2816" w:type="dxa"/>
-          </w:tcPr>
-          <w:p>
-            <w:pPr>
-              <w:spacing w:before="40" w:after="40" w:line="240" w:lineRule="auto"/>
-            </w:pPr>
+            <w:tcW w:w="2705" w:type="dxa"/>
+          </w:tcPr>
+          <w:p>
+            <w:pPr>
+              <w:spacing w:before="40" w:after="40" w:line="240" w:lineRule="auto"/>
+            </w:pPr>
+            <w:r>
+              <w:rPr>
+                <w:rFonts w:ascii="Segoe UI" w:hAnsi="Segoe UI" w:cs="Segoe UI" w:eastAsia="Segoe UI"/>
+                <w:sz w:val="16"/>
+                <w:szCs w:val="16"/>
+              </w:rPr>
+              <w:t xml:space="preserve">Origin of migrated records: </w:t>
+            </w:r>
             <w:r>
               <w:rPr>
                 <w:rFonts w:ascii="Consolas" w:hAnsi="Consolas" w:cs="Consolas" w:eastAsia="Consolas"/>
@@ -32317,15 +32543,15 @@
                 <w:szCs w:val="14"/>
                 <w:shd w:val="clear" w:color="auto" w:fill="F3F5F8"/>
               </w:rPr>
-              <w:t xml:space="preserve">source</w:t>
-            </w:r>
-            <w:r>
-              <w:rPr>
-                <w:rFonts w:ascii="Segoe UI" w:hAnsi="Segoe UI" w:cs="Segoe UI" w:eastAsia="Segoe UI"/>
-                <w:sz w:val="16"/>
-                <w:szCs w:val="16"/>
-              </w:rPr>
-              <w:t xml:space="preserve"> / </w:t>
+              <w:t xml:space="preserve">origin</w:t>
+            </w:r>
+            <w:r>
+              <w:rPr>
+                <w:rFonts w:ascii="Segoe UI" w:hAnsi="Segoe UI" w:cs="Segoe UI" w:eastAsia="Segoe UI"/>
+                <w:sz w:val="16"/>
+                <w:szCs w:val="16"/>
+              </w:rPr>
+              <w:t xml:space="preserve">, </w:t>
             </w:r>
             <w:r>
               <w:rPr>
@@ -32335,15 +32561,15 @@
                 <w:szCs w:val="14"/>
                 <w:shd w:val="clear" w:color="auto" w:fill="F3F5F8"/>
               </w:rPr>
-              <w:t xml:space="preserve">doc.source</w:t>
-            </w:r>
-            <w:r>
-              <w:rPr>
-                <w:rFonts w:ascii="Segoe UI" w:hAnsi="Segoe UI" w:cs="Segoe UI" w:eastAsia="Segoe UI"/>
-                <w:sz w:val="16"/>
-                <w:szCs w:val="16"/>
-              </w:rPr>
-              <w:t xml:space="preserve"> / </w:t>
+              <w:t xml:space="preserve">legacy_system</w:t>
+            </w:r>
+            <w:r>
+              <w:rPr>
+                <w:rFonts w:ascii="Segoe UI" w:hAnsi="Segoe UI" w:cs="Segoe UI" w:eastAsia="Segoe UI"/>
+                <w:sz w:val="16"/>
+                <w:szCs w:val="16"/>
+              </w:rPr>
+              <w:t xml:space="preserve">, </w:t>
             </w:r>
             <w:r>
               <w:rPr>
@@ -32353,15 +32579,15 @@
                 <w:szCs w:val="14"/>
                 <w:shd w:val="clear" w:color="auto" w:fill="F3F5F8"/>
               </w:rPr>
-              <w:t xml:space="preserve">details.source</w:t>
-            </w:r>
-            <w:r>
-              <w:rPr>
-                <w:rFonts w:ascii="Segoe UI" w:hAnsi="Segoe UI" w:cs="Segoe UI" w:eastAsia="Segoe UI"/>
-                <w:sz w:val="16"/>
-                <w:szCs w:val="16"/>
-              </w:rPr>
-              <w:t xml:space="preserve"> and </w:t>
+              <w:t xml:space="preserve">legacy_number</w:t>
+            </w:r>
+            <w:r>
+              <w:rPr>
+                <w:rFonts w:ascii="Segoe UI" w:hAnsi="Segoe UI" w:cs="Segoe UI" w:eastAsia="Segoe UI"/>
+                <w:sz w:val="16"/>
+                <w:szCs w:val="16"/>
+              </w:rPr>
+              <w:t xml:space="preserve">, </w:t>
             </w:r>
             <w:r>
               <w:rPr>
@@ -32371,15 +32597,15 @@
                 <w:szCs w:val="14"/>
                 <w:shd w:val="clear" w:color="auto" w:fill="F3F5F8"/>
               </w:rPr>
-              <w:t xml:space="preserve">load_batch_id</w:t>
-            </w:r>
-            <w:r>
-              <w:rPr>
-                <w:rFonts w:ascii="Segoe UI" w:hAnsi="Segoe UI" w:cs="Segoe UI" w:eastAsia="Segoe UI"/>
-                <w:sz w:val="16"/>
-                <w:szCs w:val="16"/>
-              </w:rPr>
-              <w:t xml:space="preserve"> on clients, policies, open items and claims; </w:t>
+              <w:t xml:space="preserve">migrated_at</w:t>
+            </w:r>
+            <w:r>
+              <w:rPr>
+                <w:rFonts w:ascii="Segoe UI" w:hAnsi="Segoe UI" w:cs="Segoe UI" w:eastAsia="Segoe UI"/>
+                <w:sz w:val="16"/>
+                <w:szCs w:val="16"/>
+              </w:rPr>
+              <w:t xml:space="preserve">, </w:t>
             </w:r>
             <w:r>
               <w:rPr>
@@ -32389,33 +32615,15 @@
                 <w:szCs w:val="14"/>
                 <w:shd w:val="clear" w:color="auto" w:fill="F3F5F8"/>
               </w:rPr>
-              <w:t xml:space="preserve">source_run = 'go-live:&lt;cutover&gt;'</w:t>
-            </w:r>
-            <w:r>
-              <w:rPr>
-                <w:rFonts w:ascii="Segoe UI" w:hAnsi="Segoe UI" w:cs="Segoe UI" w:eastAsia="Segoe UI"/>
-                <w:sz w:val="16"/>
-                <w:szCs w:val="16"/>
-              </w:rPr>
-              <w:t xml:space="preserve"> on opening balances</w:t>
-            </w:r>
-          </w:p>
-        </w:tc>
-        <w:tc>
-          <w:tcPr>
-            <w:tcW w:w="3182" w:type="dxa"/>
-          </w:tcPr>
-          <w:p>
-            <w:pPr>
-              <w:spacing w:before="40" w:after="40" w:line="240" w:lineRule="auto"/>
-            </w:pPr>
-            <w:r>
-              <w:rPr>
-                <w:rFonts w:ascii="Segoe UI" w:hAnsi="Segoe UI" w:cs="Segoe UI" w:eastAsia="Segoe UI"/>
-                <w:sz w:val="16"/>
-                <w:szCs w:val="16"/>
-              </w:rPr>
-              <w:t xml:space="preserve">Life of the record (</w:t>
+              <w:t xml:space="preserve">migrated_by</w:t>
+            </w:r>
+            <w:r>
+              <w:rPr>
+                <w:rFonts w:ascii="Segoe UI" w:hAnsi="Segoe UI" w:cs="Segoe UI" w:eastAsia="Segoe UI"/>
+                <w:sz w:val="16"/>
+                <w:szCs w:val="16"/>
+              </w:rPr>
+              <w:t xml:space="preserve">, </w:t>
             </w:r>
             <w:r>
               <w:rPr>
@@ -32427,13 +32635,59 @@
               </w:rPr>
               <w:t xml:space="preserve">load_batch_id</w:t>
             </w:r>
-            <w:r>
-              <w:rPr>
-                <w:rFonts w:ascii="Segoe UI" w:hAnsi="Segoe UI" w:cs="Segoe UI" w:eastAsia="Segoe UI"/>
-                <w:sz w:val="16"/>
-                <w:szCs w:val="16"/>
-              </w:rPr>
-              <w:t xml:space="preserve"> becomes empty if its batch is deleted)</w:t>
+          </w:p>
+        </w:tc>
+        <w:tc>
+          <w:tcPr>
+            <w:tcW w:w="3160" w:type="dxa"/>
+          </w:tcPr>
+          <w:p>
+            <w:pPr>
+              <w:spacing w:before="40" w:after="40" w:line="240" w:lineRule="auto"/>
+            </w:pPr>
+            <w:r>
+              <w:rPr>
+                <w:rFonts w:ascii="Segoe UI" w:hAnsi="Segoe UI" w:cs="Segoe UI" w:eastAsia="Segoe UI"/>
+                <w:sz w:val="16"/>
+                <w:szCs w:val="16"/>
+              </w:rPr>
+              <w:t xml:space="preserve">Clients, policies, receivables, claims, journal vouchers, post-dated cheques; </w:t>
+            </w:r>
+            <w:r>
+              <w:rPr>
+                <w:rFonts w:ascii="Consolas" w:hAnsi="Consolas" w:cs="Consolas" w:eastAsia="Consolas"/>
+                <w:color w:val="1F3B57"/>
+                <w:sz w:val="14"/>
+                <w:szCs w:val="14"/>
+                <w:shd w:val="clear" w:color="auto" w:fill="F3F5F8"/>
+              </w:rPr>
+              <w:t xml:space="preserve">load_batch_id</w:t>
+            </w:r>
+            <w:r>
+              <w:rPr>
+                <w:rFonts w:ascii="Segoe UI" w:hAnsi="Segoe UI" w:cs="Segoe UI" w:eastAsia="Segoe UI"/>
+                <w:sz w:val="16"/>
+                <w:szCs w:val="16"/>
+              </w:rPr>
+              <w:t xml:space="preserve"> on opening balances and CTPL authentications</w:t>
+            </w:r>
+          </w:p>
+        </w:tc>
+        <w:tc>
+          <w:tcPr>
+            <w:tcW w:w="3162" w:type="dxa"/>
+          </w:tcPr>
+          <w:p>
+            <w:pPr>
+              <w:spacing w:before="40" w:after="40" w:line="240" w:lineRule="auto"/>
+            </w:pPr>
+            <w:r>
+              <w:rPr>
+                <w:rFonts w:ascii="Segoe UI" w:hAnsi="Segoe UI" w:cs="Segoe UI" w:eastAsia="Segoe UI"/>
+                <w:sz w:val="16"/>
+                <w:szCs w:val="16"/>
+              </w:rPr>
+              <w:t xml:space="preserve">Life of the record; read-only after the load</w:t>
             </w:r>
           </w:p>
         </w:tc>
@@ -32444,20 +32698,30 @@
         </w:trPr>
         <w:tc>
           <w:tcPr>
-            <w:tcW w:w="3029" w:type="dxa"/>
-          </w:tcPr>
-          <w:p>
-            <w:pPr>
-              <w:spacing w:before="40" w:after="40" w:line="240" w:lineRule="auto"/>
-            </w:pPr>
-            <w:r>
-              <w:rPr>
-                <w:rFonts w:ascii="Segoe UI" w:hAnsi="Segoe UI" w:cs="Segoe UI" w:eastAsia="Segoe UI"/>
-                <w:sz w:val="16"/>
-                <w:szCs w:val="16"/>
-              </w:rPr>
-              <w:t xml:space="preserve">Audit entries: </w:t>
-            </w:r>
+            <w:tcW w:w="2705" w:type="dxa"/>
+          </w:tcPr>
+          <w:p>
+            <w:pPr>
+              <w:spacing w:before="40" w:after="40" w:line="240" w:lineRule="auto"/>
+            </w:pPr>
+            <w:r>
+              <w:rPr>
+                <w:rFonts w:ascii="Segoe UI" w:hAnsi="Segoe UI" w:cs="Segoe UI" w:eastAsia="Segoe UI"/>
+                <w:sz w:val="16"/>
+                <w:szCs w:val="16"/>
+              </w:rPr>
+              <w:t xml:space="preserve">Reconciliations: lines per object and measure with the legacy figure, differences with explanation, action and acceptance, sign-off slots, the signed PDF and its hash</w:t>
+            </w:r>
+          </w:p>
+        </w:tc>
+        <w:tc>
+          <w:tcPr>
+            <w:tcW w:w="3160" w:type="dxa"/>
+          </w:tcPr>
+          <w:p>
+            <w:pPr>
+              <w:spacing w:before="40" w:after="40" w:line="240" w:lineRule="auto"/>
+            </w:pPr>
             <w:r>
               <w:rPr>
                 <w:rFonts w:ascii="Consolas" w:hAnsi="Consolas" w:cs="Consolas" w:eastAsia="Consolas"/>
@@ -32466,16 +32730,67 @@
                 <w:szCs w:val="14"/>
                 <w:shd w:val="clear" w:color="auto" w:fill="F3F5F8"/>
               </w:rPr>
-              <w:t xml:space="preserve">export-current-data</w:t>
-            </w:r>
-            <w:r>
-              <w:rPr>
-                <w:rFonts w:ascii="Segoe UI" w:hAnsi="Segoe UI" w:cs="Segoe UI" w:eastAsia="Segoe UI"/>
-                <w:sz w:val="16"/>
-                <w:szCs w:val="16"/>
-              </w:rPr>
-              <w:t xml:space="preserve">, </w:t>
-            </w:r>
+              <w:t xml:space="preserve">migration_reconciliations</w:t>
+            </w:r>
+            <w:r>
+              <w:rPr>
+                <w:rFonts w:ascii="Segoe UI" w:hAnsi="Segoe UI" w:cs="Segoe UI" w:eastAsia="Segoe UI"/>
+                <w:sz w:val="16"/>
+                <w:szCs w:val="16"/>
+              </w:rPr>
+              <w:t xml:space="preserve"> and lines, differences, sign-offs</w:t>
+            </w:r>
+          </w:p>
+        </w:tc>
+        <w:tc>
+          <w:tcPr>
+            <w:tcW w:w="3162" w:type="dxa"/>
+          </w:tcPr>
+          <w:p>
+            <w:pPr>
+              <w:spacing w:before="40" w:after="40" w:line="240" w:lineRule="auto"/>
+            </w:pPr>
+            <w:r>
+              <w:rPr>
+                <w:rFonts w:ascii="Segoe UI" w:hAnsi="Segoe UI" w:cs="Segoe UI" w:eastAsia="Segoe UI"/>
+                <w:sz w:val="16"/>
+                <w:szCs w:val="16"/>
+              </w:rPr>
+              <w:t xml:space="preserve">Never purged</w:t>
+            </w:r>
+          </w:p>
+        </w:tc>
+      </w:tr>
+      <w:tr>
+        <w:trPr>
+          <w:cantSplit/>
+        </w:trPr>
+        <w:tc>
+          <w:tcPr>
+            <w:tcW w:w="2705" w:type="dxa"/>
+          </w:tcPr>
+          <w:p>
+            <w:pPr>
+              <w:spacing w:before="40" w:after="40" w:line="240" w:lineRule="auto"/>
+            </w:pPr>
+            <w:r>
+              <w:rPr>
+                <w:rFonts w:ascii="Segoe UI" w:hAnsi="Segoe UI" w:cs="Segoe UI" w:eastAsia="Segoe UI"/>
+                <w:sz w:val="16"/>
+                <w:szCs w:val="16"/>
+              </w:rPr>
+              <w:t xml:space="preserve">Mock and production runs, cutover checklist with owner, times and evidence, defects, Go / No-Go decisions with criteria, waivers and votes, lock and unlock requests</w:t>
+            </w:r>
+          </w:p>
+        </w:tc>
+        <w:tc>
+          <w:tcPr>
+            <w:tcW w:w="3160" w:type="dxa"/>
+          </w:tcPr>
+          <w:p>
+            <w:pPr>
+              <w:spacing w:before="40" w:after="40" w:line="240" w:lineRule="auto"/>
+            </w:pPr>
             <w:r>
               <w:rPr>
                 <w:rFonts w:ascii="Consolas" w:hAnsi="Consolas" w:cs="Consolas" w:eastAsia="Consolas"/>
@@ -32484,7 +32799,7 @@
                 <w:szCs w:val="14"/>
                 <w:shd w:val="clear" w:color="auto" w:fill="F3F5F8"/>
               </w:rPr>
-              <w:t xml:space="preserve">validate</w:t>
+              <w:t xml:space="preserve">migration_runs</w:t>
             </w:r>
             <w:r>
               <w:rPr>
@@ -32502,7 +32817,7 @@
                 <w:szCs w:val="14"/>
                 <w:shd w:val="clear" w:color="auto" w:fill="F3F5F8"/>
               </w:rPr>
-              <w:t xml:space="preserve">load</w:t>
+              <w:t xml:space="preserve">migration_run_steps</w:t>
             </w:r>
             <w:r>
               <w:rPr>
@@ -32520,15 +32835,15 @@
                 <w:szCs w:val="14"/>
                 <w:shd w:val="clear" w:color="auto" w:fill="F3F5F8"/>
               </w:rPr>
-              <w:t xml:space="preserve">compare</w:t>
-            </w:r>
-            <w:r>
-              <w:rPr>
-                <w:rFonts w:ascii="Segoe UI" w:hAnsi="Segoe UI" w:cs="Segoe UI" w:eastAsia="Segoe UI"/>
-                <w:sz w:val="16"/>
-                <w:szCs w:val="16"/>
-              </w:rPr>
-              <w:t xml:space="preserve"> (workbench); </w:t>
+              <w:t xml:space="preserve">migration_run_defects</w:t>
+            </w:r>
+            <w:r>
+              <w:rPr>
+                <w:rFonts w:ascii="Segoe UI" w:hAnsi="Segoe UI" w:cs="Segoe UI" w:eastAsia="Segoe UI"/>
+                <w:sz w:val="16"/>
+                <w:szCs w:val="16"/>
+              </w:rPr>
+              <w:t xml:space="preserve">, </w:t>
             </w:r>
             <w:r>
               <w:rPr>
@@ -32538,7 +32853,7 @@
                 <w:szCs w:val="14"/>
                 <w:shd w:val="clear" w:color="auto" w:fill="F3F5F8"/>
               </w:rPr>
-              <w:t xml:space="preserve">go-live-migration</w:t>
+              <w:t xml:space="preserve">go_live_decisions</w:t>
             </w:r>
             <w:r>
               <w:rPr>
@@ -32556,15 +32871,15 @@
                 <w:szCs w:val="14"/>
                 <w:shd w:val="clear" w:color="auto" w:fill="F3F5F8"/>
               </w:rPr>
-              <w:t xml:space="preserve">go-live-import</w:t>
-            </w:r>
-            <w:r>
-              <w:rPr>
-                <w:rFonts w:ascii="Segoe UI" w:hAnsi="Segoe UI" w:cs="Segoe UI" w:eastAsia="Segoe UI"/>
-                <w:sz w:val="16"/>
-                <w:szCs w:val="16"/>
-              </w:rPr>
-              <w:t xml:space="preserve"> (single-object imports); </w:t>
+              <w:t xml:space="preserve">go_live_lock_requests</w:t>
+            </w:r>
+            <w:r>
+              <w:rPr>
+                <w:rFonts w:ascii="Segoe UI" w:hAnsi="Segoe UI" w:cs="Segoe UI" w:eastAsia="Segoe UI"/>
+                <w:sz w:val="16"/>
+                <w:szCs w:val="16"/>
+              </w:rPr>
+              <w:t xml:space="preserve">, </w:t>
             </w:r>
             <w:r>
               <w:rPr>
@@ -32574,15 +32889,143 @@
                 <w:szCs w:val="14"/>
                 <w:shd w:val="clear" w:color="auto" w:fill="F3F5F8"/>
               </w:rPr>
-              <w:t xml:space="preserve">update</w:t>
-            </w:r>
-            <w:r>
-              <w:rPr>
-                <w:rFonts w:ascii="Segoe UI" w:hAnsi="Segoe UI" w:cs="Segoe UI" w:eastAsia="Segoe UI"/>
-                <w:sz w:val="16"/>
-                <w:szCs w:val="16"/>
-              </w:rPr>
-              <w:t xml:space="preserve"> of settings made on Master &gt; Configuration (including </w:t>
+              <w:t xml:space="preserve">migration_evidence</w:t>
+            </w:r>
+          </w:p>
+        </w:tc>
+        <w:tc>
+          <w:tcPr>
+            <w:tcW w:w="3162" w:type="dxa"/>
+          </w:tcPr>
+          <w:p>
+            <w:pPr>
+              <w:spacing w:before="40" w:after="40" w:line="240" w:lineRule="auto"/>
+            </w:pPr>
+            <w:r>
+              <w:rPr>
+                <w:rFonts w:ascii="Segoe UI" w:hAnsi="Segoe UI" w:cs="Segoe UI" w:eastAsia="Segoe UI"/>
+                <w:sz w:val="16"/>
+                <w:szCs w:val="16"/>
+              </w:rPr>
+              <w:t xml:space="preserve">Never purged; kept by the transaction reset</w:t>
+            </w:r>
+          </w:p>
+        </w:tc>
+      </w:tr>
+      <w:tr>
+        <w:trPr>
+          <w:cantSplit/>
+        </w:trPr>
+        <w:tc>
+          <w:tcPr>
+            <w:tcW w:w="2705" w:type="dxa"/>
+          </w:tcPr>
+          <w:p>
+            <w:pPr>
+              <w:spacing w:before="40" w:after="40" w:line="240" w:lineRule="auto"/>
+            </w:pPr>
+            <w:r>
+              <w:rPr>
+                <w:rFonts w:ascii="Segoe UI" w:hAnsi="Segoe UI" w:cs="Segoe UI" w:eastAsia="Segoe UI"/>
+                <w:sz w:val="16"/>
+                <w:szCs w:val="16"/>
+              </w:rPr>
+              <w:t xml:space="preserve">Evidence pack of a run: workbooks (masked per user), reconciliation reports, checklist, decision, evidence files and a SHA-256 manifest</w:t>
+            </w:r>
+          </w:p>
+        </w:tc>
+        <w:tc>
+          <w:tcPr>
+            <w:tcW w:w="3160" w:type="dxa"/>
+          </w:tcPr>
+          <w:p>
+            <w:pPr>
+              <w:spacing w:before="40" w:after="40" w:line="240" w:lineRule="auto"/>
+            </w:pPr>
+            <w:r>
+              <w:rPr>
+                <w:rFonts w:ascii="Segoe UI" w:hAnsi="Segoe UI" w:cs="Segoe UI" w:eastAsia="Segoe UI"/>
+                <w:sz w:val="16"/>
+                <w:szCs w:val="16"/>
+              </w:rPr>
+              <w:t xml:space="preserve">Downloaded from the run (Mock Runs tab); its hash is recorded on the run</w:t>
+            </w:r>
+          </w:p>
+        </w:tc>
+        <w:tc>
+          <w:tcPr>
+            <w:tcW w:w="3162" w:type="dxa"/>
+          </w:tcPr>
+          <w:p>
+            <w:pPr>
+              <w:spacing w:before="40" w:after="40" w:line="240" w:lineRule="auto"/>
+            </w:pPr>
+            <w:r>
+              <w:rPr>
+                <w:rFonts w:ascii="Segoe UI" w:hAnsi="Segoe UI" w:cs="Segoe UI" w:eastAsia="Segoe UI"/>
+                <w:sz w:val="16"/>
+                <w:szCs w:val="16"/>
+              </w:rPr>
+              <w:t xml:space="preserve">Archived per TISPH's record policy (Q14); criterion G11 checks the recorded hash</w:t>
+            </w:r>
+          </w:p>
+        </w:tc>
+      </w:tr>
+      <w:tr>
+        <w:trPr>
+          <w:cantSplit/>
+        </w:trPr>
+        <w:tc>
+          <w:tcPr>
+            <w:tcW w:w="2705" w:type="dxa"/>
+          </w:tcPr>
+          <w:p>
+            <w:pPr>
+              <w:spacing w:before="40" w:after="40" w:line="240" w:lineRule="auto"/>
+            </w:pPr>
+            <w:r>
+              <w:rPr>
+                <w:rFonts w:ascii="Segoe UI" w:hAnsi="Segoe UI" w:cs="Segoe UI" w:eastAsia="Segoe UI"/>
+                <w:sz w:val="16"/>
+                <w:szCs w:val="16"/>
+              </w:rPr>
+              <w:t xml:space="preserve">Audit entries of every action of the workspace and one entry per migrated record</w:t>
+            </w:r>
+          </w:p>
+        </w:tc>
+        <w:tc>
+          <w:tcPr>
+            <w:tcW w:w="3160" w:type="dxa"/>
+          </w:tcPr>
+          <w:p>
+            <w:pPr>
+              <w:spacing w:before="40" w:after="40" w:line="240" w:lineRule="auto"/>
+            </w:pPr>
+            <w:r>
+              <w:rPr>
+                <w:rFonts w:ascii="Segoe UI" w:hAnsi="Segoe UI" w:cs="Segoe UI" w:eastAsia="Segoe UI"/>
+                <w:sz w:val="16"/>
+                <w:szCs w:val="16"/>
+              </w:rPr>
+              <w:t xml:space="preserve">Audit trail</w:t>
+            </w:r>
+          </w:p>
+        </w:tc>
+        <w:tc>
+          <w:tcPr>
+            <w:tcW w:w="3162" w:type="dxa"/>
+          </w:tcPr>
+          <w:p>
+            <w:pPr>
+              <w:spacing w:before="40" w:after="40" w:line="240" w:lineRule="auto"/>
+            </w:pPr>
+            <w:r>
+              <w:rPr>
+                <w:rFonts w:ascii="Segoe UI" w:hAnsi="Segoe UI" w:cs="Segoe UI" w:eastAsia="Segoe UI"/>
+                <w:sz w:val="16"/>
+                <w:szCs w:val="16"/>
+              </w:rPr>
+              <w:t xml:space="preserve">Not purged unless </w:t>
             </w:r>
             <w:r>
               <w:rPr>
@@ -32592,78 +33035,6 @@
                 <w:szCs w:val="14"/>
                 <w:shd w:val="clear" w:color="auto" w:fill="F3F5F8"/>
               </w:rPr>
-              <w:t xml:space="preserve">golive.cutover_date</w:t>
-            </w:r>
-            <w:r>
-              <w:rPr>
-                <w:rFonts w:ascii="Segoe UI" w:hAnsi="Segoe UI" w:cs="Segoe UI" w:eastAsia="Segoe UI"/>
-                <w:sz w:val="16"/>
-                <w:szCs w:val="16"/>
-              </w:rPr>
-              <w:t xml:space="preserve"> and </w:t>
-            </w:r>
-            <w:r>
-              <w:rPr>
-                <w:rFonts w:ascii="Consolas" w:hAnsi="Consolas" w:cs="Consolas" w:eastAsia="Consolas"/>
-                <w:color w:val="1F3B57"/>
-                <w:sz w:val="14"/>
-                <w:szCs w:val="14"/>
-                <w:shd w:val="clear" w:color="auto" w:fill="F3F5F8"/>
-              </w:rPr>
-              <w:t xml:space="preserve">golive.locked</w:t>
-            </w:r>
-            <w:r>
-              <w:rPr>
-                <w:rFonts w:ascii="Segoe UI" w:hAnsi="Segoe UI" w:cs="Segoe UI" w:eastAsia="Segoe UI"/>
-                <w:sz w:val="16"/>
-                <w:szCs w:val="16"/>
-              </w:rPr>
-              <w:t xml:space="preserve">); the reset</w:t>
-            </w:r>
-          </w:p>
-        </w:tc>
-        <w:tc>
-          <w:tcPr>
-            <w:tcW w:w="2816" w:type="dxa"/>
-          </w:tcPr>
-          <w:p>
-            <w:pPr>
-              <w:spacing w:before="40" w:after="40" w:line="240" w:lineRule="auto"/>
-            </w:pPr>
-            <w:r>
-              <w:rPr>
-                <w:rFonts w:ascii="Segoe UI" w:hAnsi="Segoe UI" w:cs="Segoe UI" w:eastAsia="Segoe UI"/>
-                <w:sz w:val="16"/>
-                <w:szCs w:val="16"/>
-              </w:rPr>
-              <w:t xml:space="preserve">Audit trail</w:t>
-            </w:r>
-          </w:p>
-        </w:tc>
-        <w:tc>
-          <w:tcPr>
-            <w:tcW w:w="3182" w:type="dxa"/>
-          </w:tcPr>
-          <w:p>
-            <w:pPr>
-              <w:spacing w:before="40" w:after="40" w:line="240" w:lineRule="auto"/>
-            </w:pPr>
-            <w:r>
-              <w:rPr>
-                <w:rFonts w:ascii="Segoe UI" w:hAnsi="Segoe UI" w:cs="Segoe UI" w:eastAsia="Segoe UI"/>
-                <w:sz w:val="16"/>
-                <w:szCs w:val="16"/>
-              </w:rPr>
-              <w:t xml:space="preserve">Not purged unless </w:t>
-            </w:r>
-            <w:r>
-              <w:rPr>
-                <w:rFonts w:ascii="Consolas" w:hAnsi="Consolas" w:cs="Consolas" w:eastAsia="Consolas"/>
-                <w:color w:val="1F3B57"/>
-                <w:sz w:val="14"/>
-                <w:szCs w:val="14"/>
-                <w:shd w:val="clear" w:color="auto" w:fill="F3F5F8"/>
-              </w:rPr>
               <w:t xml:space="preserve">housekeeping.audit_log_days</w:t>
             </w:r>
             <w:r>
@@ -32672,86 +33043,7 @@
                 <w:sz w:val="16"/>
                 <w:szCs w:val="16"/>
               </w:rPr>
-              <w:t xml:space="preserve"> is set, and then never below 7 years (2,557 days). The reset keeps it unless run with </w:t>
-            </w:r>
-            <w:r>
-              <w:rPr>
-                <w:rFonts w:ascii="Consolas" w:hAnsi="Consolas" w:cs="Consolas" w:eastAsia="Consolas"/>
-                <w:color w:val="1F3B57"/>
-                <w:sz w:val="14"/>
-                <w:szCs w:val="14"/>
-                <w:shd w:val="clear" w:color="auto" w:fill="F3F5F8"/>
-              </w:rPr>
-              <w:t xml:space="preserve">--purge-audit</w:t>
-            </w:r>
-          </w:p>
-        </w:tc>
-      </w:tr>
-      <w:tr>
-        <w:trPr>
-          <w:cantSplit/>
-        </w:trPr>
-        <w:tc>
-          <w:tcPr>
-            <w:tcW w:w="3029" w:type="dxa"/>
-          </w:tcPr>
-          <w:p>
-            <w:pPr>
-              <w:spacing w:before="40" w:after="40" w:line="240" w:lineRule="auto"/>
-            </w:pPr>
-            <w:r>
-              <w:rPr>
-                <w:rFonts w:ascii="Segoe UI" w:hAnsi="Segoe UI" w:cs="Segoe UI" w:eastAsia="Segoe UI"/>
-                <w:sz w:val="16"/>
-                <w:szCs w:val="16"/>
-              </w:rPr>
-              <w:t xml:space="preserve">Workbooks as uploaded, errors workbooks, reconciliation workbooks, extract files with checksums, signed reports, cutover log</w:t>
-            </w:r>
-          </w:p>
-        </w:tc>
-        <w:tc>
-          <w:tcPr>
-            <w:tcW w:w="2816" w:type="dxa"/>
-          </w:tcPr>
-          <w:p>
-            <w:pPr>
-              <w:spacing w:before="40" w:after="40" w:line="240" w:lineRule="auto"/>
-            </w:pPr>
-            <w:r>
-              <w:rPr>
-                <w:rFonts w:ascii="Segoe UI" w:hAnsi="Segoe UI" w:cs="Segoe UI" w:eastAsia="Segoe UI"/>
-                <w:sz w:val="16"/>
-                <w:szCs w:val="16"/>
-              </w:rPr>
-              <w:t xml:space="preserve">Project records outside BrokerVerse </w:t>
-            </w:r>
-            <w:r>
-              <w:rPr>
-                <w:rFonts w:ascii="Segoe UI" w:hAnsi="Segoe UI" w:cs="Segoe UI" w:eastAsia="Segoe UI"/>
-                <w:b/>
-                <w:bCs/>
-                <w:sz w:val="16"/>
-                <w:szCs w:val="16"/>
-              </w:rPr>
-              <w:t xml:space="preserve">Procedure</w:t>
-            </w:r>
-          </w:p>
-        </w:tc>
-        <w:tc>
-          <w:tcPr>
-            <w:tcW w:w="3182" w:type="dxa"/>
-          </w:tcPr>
-          <w:p>
-            <w:pPr>
-              <w:spacing w:before="40" w:after="40" w:line="240" w:lineRule="auto"/>
-            </w:pPr>
-            <w:r>
-              <w:rPr>
-                <w:rFonts w:ascii="Segoe UI" w:hAnsi="Segoe UI" w:cs="Segoe UI" w:eastAsia="Segoe UI"/>
-                <w:sz w:val="16"/>
-                <w:szCs w:val="16"/>
-              </w:rPr>
-              <w:t xml:space="preserve">Per TISPH's record policy (Q14)</w:t>
+              <w:t xml:space="preserve"> is set, and then never below 7 years</w:t>
             </w:r>
           </w:p>
         </w:tc>
@@ -32764,17 +33056,6 @@
           <w:sz w:val="12"/>
         </w:rPr>
       </w:pPr>
-    </w:p>
-    <w:p xmlns:a="http://schemas.openxmlformats.org/drawingml/2006/main" xmlns:pic="http://schemas.openxmlformats.org/drawingml/2006/picture">
-      <w:pPr>
-        <w:jc w:val="both"/>
-      </w:pPr>
-      <w:r>
-        <w:rPr>
-          <w:rFonts w:ascii="Segoe UI" w:hAnsi="Segoe UI" w:cs="Segoe UI" w:eastAsia="Segoe UI"/>
-        </w:rPr>
-        <w:t xml:space="preserve">The workbench does not keep the uploaded file itself, only the rows read from it. Because the rows of a batch are deleted after a year by default and every load record goes with a transaction reset, the final migration workbook, its errors and reconciliation workbooks, the extract files and the signed reports are archived outside BrokerVerse at CO-10 (criterion G11), and the housekeeping period may be set to 0 for the migration year (Q14).</w:t>
-      </w:r>
     </w:p>
     <w:p xmlns:a="http://schemas.openxmlformats.org/drawingml/2006/main" xmlns:pic="http://schemas.openxmlformats.org/drawingml/2006/picture">
       <w:pPr>
@@ -32789,7 +33070,7 @@
         <w:rPr>
           <w:rFonts w:ascii="Segoe UI" w:hAnsi="Segoe UI" w:cs="Segoe UI" w:eastAsia="Segoe UI"/>
         </w:rPr>
-        <w:t xml:space="preserve">Audit coverage of the migration and its gaps</w:t>
+        <w:t xml:space="preserve">Audit coverage of the migration</w:t>
       </w:r>
       <w:bookmarkEnd w:id="1050"/>
     </w:p>
@@ -32815,9 +33096,8 @@
         <w:tblLook w:val="04A0" w:firstRow="1" w:lastRow="0" w:firstColumn="1" w:lastColumn="0" w:noHBand="0" w:noVBand="1"/>
       </w:tblPr>
       <w:tblGrid>
-        <w:gridCol w:w="2782"/>
-        <w:gridCol w:w="2965"/>
-        <w:gridCol w:w="3280"/>
+        <w:gridCol w:w="3077"/>
+        <w:gridCol w:w="5950"/>
       </w:tblGrid>
       <w:tr>
         <w:trPr>
@@ -32827,7 +33107,7 @@
         </w:trPr>
         <w:tc>
           <w:tcPr>
-            <w:tcW w:w="2782" w:type="dxa"/>
+            <w:tcW w:w="3077" w:type="dxa"/>
             <w:shd w:val="clear" w:color="auto" w:fill="E8F0F8"/>
             <w:vAlign w:val="center"/>
           </w:tcPr>
@@ -32849,7 +33129,7 @@
         </w:tc>
         <w:tc>
           <w:tcPr>
-            <w:tcW w:w="2965" w:type="dxa"/>
+            <w:tcW w:w="5950" w:type="dxa"/>
             <w:shd w:val="clear" w:color="auto" w:fill="E8F0F8"/>
             <w:vAlign w:val="center"/>
           </w:tcPr>
@@ -32865,29 +33145,7 @@
                 <w:sz w:val="16"/>
                 <w:szCs w:val="16"/>
               </w:rPr>
-              <w:t xml:space="preserve">What the audit trail records</w:t>
-            </w:r>
-          </w:p>
-        </w:tc>
-        <w:tc>
-          <w:tcPr>
-            <w:tcW w:w="3280" w:type="dxa"/>
-            <w:shd w:val="clear" w:color="auto" w:fill="E8F0F8"/>
-            <w:vAlign w:val="center"/>
-          </w:tcPr>
-          <w:p>
-            <w:pPr>
-              <w:spacing w:before="40" w:after="40" w:line="240" w:lineRule="auto"/>
-            </w:pPr>
-            <w:r>
-              <w:rPr>
-                <w:rFonts w:ascii="Segoe UI" w:hAnsi="Segoe UI" w:cs="Segoe UI" w:eastAsia="Segoe UI"/>
-                <w:b/>
-                <w:bCs/>
-                <w:sz w:val="16"/>
-                <w:szCs w:val="16"/>
-              </w:rPr>
-              <w:t xml:space="preserve">Gap and compensating procedure</w:t>
+              <w:t xml:space="preserve">What the system records and enforces</w:t>
             </w:r>
           </w:p>
         </w:tc>
@@ -32898,7 +33156,7 @@
         </w:trPr>
         <w:tc>
           <w:tcPr>
-            <w:tcW w:w="2782" w:type="dxa"/>
+            <w:tcW w:w="3077" w:type="dxa"/>
           </w:tcPr>
           <w:p>
             <w:pPr>
@@ -32916,37 +33174,19 @@
         </w:tc>
         <w:tc>
           <w:tcPr>
-            <w:tcW w:w="2965" w:type="dxa"/>
-          </w:tcPr>
-          <w:p>
-            <w:pPr>
-              <w:spacing w:before="40" w:after="40" w:line="240" w:lineRule="auto"/>
-            </w:pPr>
-            <w:r>
-              <w:rPr>
-                <w:rFonts w:ascii="Segoe UI" w:hAnsi="Segoe UI" w:cs="Segoe UI" w:eastAsia="Segoe UI"/>
-                <w:sz w:val="16"/>
-                <w:szCs w:val="16"/>
-              </w:rPr>
-              <w:t xml:space="preserve">One entry per batch: kit, file name, rows read, rows in error, actor, time</w:t>
-            </w:r>
-          </w:p>
-        </w:tc>
-        <w:tc>
-          <w:tcPr>
-            <w:tcW w:w="3280" w:type="dxa"/>
-          </w:tcPr>
-          <w:p>
-            <w:pPr>
-              <w:spacing w:before="40" w:after="40" w:line="240" w:lineRule="auto"/>
-            </w:pPr>
-            <w:r>
-              <w:rPr>
-                <w:rFonts w:ascii="Segoe UI" w:hAnsi="Segoe UI" w:cs="Segoe UI" w:eastAsia="Segoe UI"/>
-                <w:sz w:val="16"/>
-                <w:szCs w:val="16"/>
-              </w:rPr>
-              <w:t xml:space="preserve">None for the event. The row values are in </w:t>
+            <w:tcW w:w="5950" w:type="dxa"/>
+          </w:tcPr>
+          <w:p>
+            <w:pPr>
+              <w:spacing w:before="40" w:after="40" w:line="240" w:lineRule="auto"/>
+            </w:pPr>
+            <w:r>
+              <w:rPr>
+                <w:rFonts w:ascii="Segoe UI" w:hAnsi="Segoe UI" w:cs="Segoe UI" w:eastAsia="Segoe UI"/>
+                <w:sz w:val="16"/>
+                <w:szCs w:val="16"/>
+              </w:rPr>
+              <w:t xml:space="preserve">Load entry (</w:t>
             </w:r>
             <w:r>
               <w:rPr>
@@ -32956,15 +33196,15 @@
                 <w:szCs w:val="14"/>
                 <w:shd w:val="clear" w:color="auto" w:fill="F3F5F8"/>
               </w:rPr>
-              <w:t xml:space="preserve">data_load_rows</w:t>
-            </w:r>
-            <w:r>
-              <w:rPr>
-                <w:rFonts w:ascii="Segoe UI" w:hAnsi="Segoe UI" w:cs="Segoe UI" w:eastAsia="Segoe UI"/>
-                <w:sz w:val="16"/>
-                <w:szCs w:val="16"/>
-              </w:rPr>
-              <w:t xml:space="preserve"> until housekeeping or a reset removes them; the archived workbook is the lasting record</w:t>
+              <w:t xml:space="preserve">validate</w:t>
+            </w:r>
+            <w:r>
+              <w:rPr>
+                <w:rFonts w:ascii="Segoe UI" w:hAnsi="Segoe UI" w:cs="Segoe UI" w:eastAsia="Segoe UI"/>
+                <w:sz w:val="16"/>
+                <w:szCs w:val="16"/>
+              </w:rPr>
+              <w:t xml:space="preserve">) with the file, its hash and the counts per result; every row with its result and, for a changed record, the fields changed with the values before. A file identical to an earlier load is flagged</w:t>
             </w:r>
           </w:p>
         </w:tc>
@@ -32975,65 +33215,55 @@
         </w:trPr>
         <w:tc>
           <w:tcPr>
-            <w:tcW w:w="2782" w:type="dxa"/>
-          </w:tcPr>
-          <w:p>
-            <w:pPr>
-              <w:spacing w:before="40" w:after="40" w:line="240" w:lineRule="auto"/>
-            </w:pPr>
-            <w:r>
-              <w:rPr>
-                <w:rFonts w:ascii="Segoe UI" w:hAnsi="Segoe UI" w:cs="Segoe UI" w:eastAsia="Segoe UI"/>
-                <w:sz w:val="16"/>
-                <w:szCs w:val="16"/>
-              </w:rPr>
-              <w:t xml:space="preserve">Load of a workbook</w:t>
-            </w:r>
-          </w:p>
-        </w:tc>
-        <w:tc>
-          <w:tcPr>
-            <w:tcW w:w="2965" w:type="dxa"/>
-          </w:tcPr>
-          <w:p>
-            <w:pPr>
-              <w:spacing w:before="40" w:after="40" w:line="240" w:lineRule="auto"/>
-            </w:pPr>
-            <w:r>
-              <w:rPr>
-                <w:rFonts w:ascii="Segoe UI" w:hAnsi="Segoe UI" w:cs="Segoe UI" w:eastAsia="Segoe UI"/>
-                <w:sz w:val="16"/>
-                <w:szCs w:val="16"/>
-              </w:rPr>
-              <w:t xml:space="preserve">One entry per batch: kit, loaded counts per sheet, "valid rows only", usernames of new users</w:t>
-            </w:r>
-          </w:p>
-        </w:tc>
-        <w:tc>
-          <w:tcPr>
-            <w:tcW w:w="3280" w:type="dxa"/>
-          </w:tcPr>
-          <w:p>
-            <w:pPr>
-              <w:spacing w:before="40" w:after="40" w:line="240" w:lineRule="auto"/>
-            </w:pPr>
-            <w:r>
-              <w:rPr>
-                <w:rFonts w:ascii="Segoe UI" w:hAnsi="Segoe UI" w:cs="Segoe UI" w:eastAsia="Segoe UI"/>
-                <w:b/>
-                <w:bCs/>
-                <w:sz w:val="16"/>
-                <w:szCs w:val="16"/>
-              </w:rPr>
-              <w:t xml:space="preserve">No before and after values per record</w:t>
-            </w:r>
-            <w:r>
-              <w:rPr>
-                <w:rFonts w:ascii="Segoe UI" w:hAnsi="Segoe UI" w:cs="Segoe UI" w:eastAsia="Segoe UI"/>
-                <w:sz w:val="16"/>
-                <w:szCs w:val="16"/>
-              </w:rPr>
-              <w:t xml:space="preserve"> (BRD 5.14). A record created or changed by a workbook has no audit entry of its own. Compensation: the archived workbook, the reconciliation report and the witness signature at CO-5</w:t>
+            <w:tcW w:w="3077" w:type="dxa"/>
+          </w:tcPr>
+          <w:p>
+            <w:pPr>
+              <w:spacing w:before="40" w:after="40" w:line="240" w:lineRule="auto"/>
+            </w:pPr>
+            <w:r>
+              <w:rPr>
+                <w:rFonts w:ascii="Segoe UI" w:hAnsi="Segoe UI" w:cs="Segoe UI" w:eastAsia="Segoe UI"/>
+                <w:sz w:val="16"/>
+                <w:szCs w:val="16"/>
+              </w:rPr>
+              <w:t xml:space="preserve">Approval of a load</w:t>
+            </w:r>
+          </w:p>
+        </w:tc>
+        <w:tc>
+          <w:tcPr>
+            <w:tcW w:w="5950" w:type="dxa"/>
+          </w:tcPr>
+          <w:p>
+            <w:pPr>
+              <w:spacing w:before="40" w:after="40" w:line="240" w:lineRule="auto"/>
+            </w:pPr>
+            <w:r>
+              <w:rPr>
+                <w:rFonts w:ascii="Segoe UI" w:hAnsi="Segoe UI" w:cs="Segoe UI" w:eastAsia="Segoe UI"/>
+                <w:sz w:val="16"/>
+                <w:szCs w:val="16"/>
+              </w:rPr>
+              <w:t xml:space="preserve">Submit, approve, reject (reason from the list) and withdraw are audited. The approver must hold </w:t>
+            </w:r>
+            <w:r>
+              <w:rPr>
+                <w:rFonts w:ascii="Consolas" w:hAnsi="Consolas" w:cs="Consolas" w:eastAsia="Consolas"/>
+                <w:color w:val="1F3B57"/>
+                <w:sz w:val="14"/>
+                <w:szCs w:val="14"/>
+                <w:shd w:val="clear" w:color="auto" w:fill="F3F5F8"/>
+              </w:rPr>
+              <w:t xml:space="preserve">approve:data-load</w:t>
+            </w:r>
+            <w:r>
+              <w:rPr>
+                <w:rFonts w:ascii="Segoe UI" w:hAnsi="Segoe UI" w:cs="Segoe UI" w:eastAsia="Segoe UI"/>
+                <w:sz w:val="16"/>
+                <w:szCs w:val="16"/>
+              </w:rPr>
+              <w:t xml:space="preserve"> and is never the uploader, the submitter or a user who resolved one of the load's duplicates (refused by the server). A segregation-of-duties rule flags anyone holding both write and approve. Load approval cannot be switched off in production or pre-production</w:t>
             </w:r>
           </w:p>
         </w:tc>
@@ -33044,19 +33274,37 @@
         </w:trPr>
         <w:tc>
           <w:tcPr>
-            <w:tcW w:w="2782" w:type="dxa"/>
-          </w:tcPr>
-          <w:p>
-            <w:pPr>
-              <w:spacing w:before="40" w:after="40" w:line="240" w:lineRule="auto"/>
-            </w:pPr>
-            <w:r>
-              <w:rPr>
-                <w:rFonts w:ascii="Segoe UI" w:hAnsi="Segoe UI" w:cs="Segoe UI" w:eastAsia="Segoe UI"/>
-                <w:sz w:val="16"/>
-                <w:szCs w:val="16"/>
-              </w:rPr>
-              <w:t xml:space="preserve">Settings changed by the Settings sheet (for example </w:t>
+            <w:tcW w:w="3077" w:type="dxa"/>
+          </w:tcPr>
+          <w:p>
+            <w:pPr>
+              <w:spacing w:before="40" w:after="40" w:line="240" w:lineRule="auto"/>
+            </w:pPr>
+            <w:r>
+              <w:rPr>
+                <w:rFonts w:ascii="Segoe UI" w:hAnsi="Segoe UI" w:cs="Segoe UI" w:eastAsia="Segoe UI"/>
+                <w:sz w:val="16"/>
+                <w:szCs w:val="16"/>
+              </w:rPr>
+              <w:t xml:space="preserve">Load</w:t>
+            </w:r>
+          </w:p>
+        </w:tc>
+        <w:tc>
+          <w:tcPr>
+            <w:tcW w:w="5950" w:type="dxa"/>
+          </w:tcPr>
+          <w:p>
+            <w:pPr>
+              <w:spacing w:before="40" w:after="40" w:line="240" w:lineRule="auto"/>
+            </w:pPr>
+            <w:r>
+              <w:rPr>
+                <w:rFonts w:ascii="Segoe UI" w:hAnsi="Segoe UI" w:cs="Segoe UI" w:eastAsia="Segoe UI"/>
+                <w:sz w:val="16"/>
+                <w:szCs w:val="16"/>
+              </w:rPr>
+              <w:t xml:space="preserve">One </w:t>
             </w:r>
             <w:r>
               <w:rPr>
@@ -33066,51 +33314,15 @@
                 <w:szCs w:val="14"/>
                 <w:shd w:val="clear" w:color="auto" w:fill="F3F5F8"/>
               </w:rPr>
-              <w:t xml:space="preserve">golive.cutover_date</w:t>
-            </w:r>
-            <w:r>
-              <w:rPr>
-                <w:rFonts w:ascii="Segoe UI" w:hAnsi="Segoe UI" w:cs="Segoe UI" w:eastAsia="Segoe UI"/>
-                <w:sz w:val="16"/>
-                <w:szCs w:val="16"/>
-              </w:rPr>
-              <w:t xml:space="preserve">)</w:t>
-            </w:r>
-          </w:p>
-        </w:tc>
-        <w:tc>
-          <w:tcPr>
-            <w:tcW w:w="2965" w:type="dxa"/>
-          </w:tcPr>
-          <w:p>
-            <w:pPr>
-              <w:spacing w:before="40" w:after="40" w:line="240" w:lineRule="auto"/>
-            </w:pPr>
-            <w:r>
-              <w:rPr>
-                <w:rFonts w:ascii="Segoe UI" w:hAnsi="Segoe UI" w:cs="Segoe UI" w:eastAsia="Segoe UI"/>
-                <w:sz w:val="16"/>
-                <w:szCs w:val="16"/>
-              </w:rPr>
-              <w:t xml:space="preserve">Only the load entry (counts)</w:t>
-            </w:r>
-          </w:p>
-        </w:tc>
-        <w:tc>
-          <w:tcPr>
-            <w:tcW w:w="3280" w:type="dxa"/>
-          </w:tcPr>
-          <w:p>
-            <w:pPr>
-              <w:spacing w:before="40" w:after="40" w:line="240" w:lineRule="auto"/>
-            </w:pPr>
-            <w:r>
-              <w:rPr>
-                <w:rFonts w:ascii="Segoe UI" w:hAnsi="Segoe UI" w:cs="Segoe UI" w:eastAsia="Segoe UI"/>
-                <w:sz w:val="16"/>
-                <w:szCs w:val="16"/>
-              </w:rPr>
-              <w:t xml:space="preserve">Set </w:t>
+              <w:t xml:space="preserve">migrate-create</w:t>
+            </w:r>
+            <w:r>
+              <w:rPr>
+                <w:rFonts w:ascii="Segoe UI" w:hAnsi="Segoe UI" w:cs="Segoe UI" w:eastAsia="Segoe UI"/>
+                <w:sz w:val="16"/>
+                <w:szCs w:val="16"/>
+              </w:rPr>
+              <w:t xml:space="preserve"> or </w:t>
             </w:r>
             <w:r>
               <w:rPr>
@@ -33120,15 +33332,15 @@
                 <w:szCs w:val="14"/>
                 <w:shd w:val="clear" w:color="auto" w:fill="F3F5F8"/>
               </w:rPr>
-              <w:t xml:space="preserve">golive.cutover_date</w:t>
-            </w:r>
-            <w:r>
-              <w:rPr>
-                <w:rFonts w:ascii="Segoe UI" w:hAnsi="Segoe UI" w:cs="Segoe UI" w:eastAsia="Segoe UI"/>
-                <w:sz w:val="16"/>
-                <w:szCs w:val="16"/>
-              </w:rPr>
-              <w:t xml:space="preserve"> on Master &gt; Configuration, which records before and after values (section 12, step 7)</w:t>
+              <w:t xml:space="preserve">migrate-update</w:t>
+            </w:r>
+            <w:r>
+              <w:rPr>
+                <w:rFonts w:ascii="Segoe UI" w:hAnsi="Segoe UI" w:cs="Segoe UI" w:eastAsia="Segoe UI"/>
+                <w:sz w:val="16"/>
+                <w:szCs w:val="16"/>
+              </w:rPr>
+              <w:t xml:space="preserve"> entry per record with the values before and after, the load and its number, in the load transaction; the record's activity log starts with "Migrated from &lt;legacy system&gt;, load MIG-000012". A load that fails saves nothing and writes no record entry</w:t>
             </w:r>
           </w:p>
         </w:tc>
@@ -33139,12 +33351,38 @@
         </w:trPr>
         <w:tc>
           <w:tcPr>
-            <w:tcW w:w="2782" w:type="dxa"/>
-          </w:tcPr>
-          <w:p>
-            <w:pPr>
-              <w:spacing w:before="40" w:after="40" w:line="240" w:lineRule="auto"/>
-            </w:pPr>
+            <w:tcW w:w="3077" w:type="dxa"/>
+          </w:tcPr>
+          <w:p>
+            <w:pPr>
+              <w:spacing w:before="40" w:after="40" w:line="240" w:lineRule="auto"/>
+            </w:pPr>
+            <w:r>
+              <w:rPr>
+                <w:rFonts w:ascii="Segoe UI" w:hAnsi="Segoe UI" w:cs="Segoe UI" w:eastAsia="Segoe UI"/>
+                <w:sz w:val="16"/>
+                <w:szCs w:val="16"/>
+              </w:rPr>
+              <w:t xml:space="preserve">Undo of a load (before the lock only)</w:t>
+            </w:r>
+          </w:p>
+        </w:tc>
+        <w:tc>
+          <w:tcPr>
+            <w:tcW w:w="5950" w:type="dxa"/>
+          </w:tcPr>
+          <w:p>
+            <w:pPr>
+              <w:spacing w:before="40" w:after="40" w:line="240" w:lineRule="auto"/>
+            </w:pPr>
+            <w:r>
+              <w:rPr>
+                <w:rFonts w:ascii="Segoe UI" w:hAnsi="Segoe UI" w:cs="Segoe UI" w:eastAsia="Segoe UI"/>
+                <w:sz w:val="16"/>
+                <w:szCs w:val="16"/>
+              </w:rPr>
+              <w:t xml:space="preserve">Requested with a reason and approved by a second person; refused while a later record depends on the load. </w:t>
+            </w:r>
             <w:r>
               <w:rPr>
                 <w:rFonts w:ascii="Consolas" w:hAnsi="Consolas" w:cs="Consolas" w:eastAsia="Consolas"/>
@@ -33153,33 +33391,38 @@
                 <w:szCs w:val="14"/>
                 <w:shd w:val="clear" w:color="auto" w:fill="F3F5F8"/>
               </w:rPr>
-              <w:t xml:space="preserve">golive.locked</w:t>
-            </w:r>
-            <w:r>
-              <w:rPr>
-                <w:rFonts w:ascii="Segoe UI" w:hAnsi="Segoe UI" w:cs="Segoe UI" w:eastAsia="Segoe UI"/>
-                <w:sz w:val="16"/>
-                <w:szCs w:val="16"/>
-              </w:rPr>
-              <w:t xml:space="preserve"> switched on or off</w:t>
-            </w:r>
-          </w:p>
-        </w:tc>
-        <w:tc>
-          <w:tcPr>
-            <w:tcW w:w="2965" w:type="dxa"/>
-          </w:tcPr>
-          <w:p>
-            <w:pPr>
-              <w:spacing w:before="40" w:after="40" w:line="240" w:lineRule="auto"/>
-            </w:pPr>
-            <w:r>
-              <w:rPr>
-                <w:rFonts w:ascii="Segoe UI" w:hAnsi="Segoe UI" w:cs="Segoe UI" w:eastAsia="Segoe UI"/>
-                <w:sz w:val="16"/>
-                <w:szCs w:val="16"/>
-              </w:rPr>
-              <w:t xml:space="preserve">Settings </w:t>
+              <w:t xml:space="preserve">migrate-undo</w:t>
+            </w:r>
+            <w:r>
+              <w:rPr>
+                <w:rFonts w:ascii="Segoe UI" w:hAnsi="Segoe UI" w:cs="Segoe UI" w:eastAsia="Segoe UI"/>
+                <w:sz w:val="16"/>
+                <w:szCs w:val="16"/>
+              </w:rPr>
+              <w:t xml:space="preserve"> entry per record</w:t>
+            </w:r>
+          </w:p>
+        </w:tc>
+      </w:tr>
+      <w:tr>
+        <w:trPr>
+          <w:cantSplit/>
+        </w:trPr>
+        <w:tc>
+          <w:tcPr>
+            <w:tcW w:w="3077" w:type="dxa"/>
+          </w:tcPr>
+          <w:p>
+            <w:pPr>
+              <w:spacing w:before="40" w:after="40" w:line="240" w:lineRule="auto"/>
+            </w:pPr>
+            <w:r>
+              <w:rPr>
+                <w:rFonts w:ascii="Segoe UI" w:hAnsi="Segoe UI" w:cs="Segoe UI" w:eastAsia="Segoe UI"/>
+                <w:sz w:val="16"/>
+                <w:szCs w:val="16"/>
+              </w:rPr>
+              <w:t xml:space="preserve">Settings owned by the workspace (</w:t>
             </w:r>
             <w:r>
               <w:rPr>
@@ -33189,43 +33432,87 @@
                 <w:szCs w:val="14"/>
                 <w:shd w:val="clear" w:color="auto" w:fill="F3F5F8"/>
               </w:rPr>
-              <w:t xml:space="preserve">update</w:t>
-            </w:r>
-            <w:r>
-              <w:rPr>
-                <w:rFonts w:ascii="Segoe UI" w:hAnsi="Segoe UI" w:cs="Segoe UI" w:eastAsia="Segoe UI"/>
-                <w:sz w:val="16"/>
-                <w:szCs w:val="16"/>
-              </w:rPr>
-              <w:t xml:space="preserve"> entry with before and after values and the actor</w:t>
-            </w:r>
-          </w:p>
-        </w:tc>
-        <w:tc>
-          <w:tcPr>
-            <w:tcW w:w="3280" w:type="dxa"/>
-          </w:tcPr>
-          <w:p>
-            <w:pPr>
-              <w:spacing w:before="40" w:after="40" w:line="240" w:lineRule="auto"/>
-            </w:pPr>
-            <w:r>
-              <w:rPr>
-                <w:rFonts w:ascii="Segoe UI" w:hAnsi="Segoe UI" w:cs="Segoe UI" w:eastAsia="Segoe UI"/>
-                <w:b/>
-                <w:bCs/>
-                <w:sz w:val="16"/>
-                <w:szCs w:val="16"/>
-              </w:rPr>
-              <w:t xml:space="preserve">No second-person approval</w:t>
-            </w:r>
-            <w:r>
-              <w:rPr>
-                <w:rFonts w:ascii="Segoe UI" w:hAnsi="Segoe UI" w:cs="Segoe UI" w:eastAsia="Segoe UI"/>
-                <w:sz w:val="16"/>
-                <w:szCs w:val="16"/>
-              </w:rPr>
-              <w:t xml:space="preserve">: one System Administrator can switch the lock off and run the reset. Compensation: second person present (section 14); the hypercare and monthly audit reviews check that the lock stayed on (section 18)</w:t>
+              <w:t xml:space="preserve">golive.*</w:t>
+            </w:r>
+            <w:r>
+              <w:rPr>
+                <w:rFonts w:ascii="Segoe UI" w:hAnsi="Segoe UI" w:cs="Segoe UI" w:eastAsia="Segoe UI"/>
+                <w:sz w:val="16"/>
+                <w:szCs w:val="16"/>
+              </w:rPr>
+              <w:t xml:space="preserve">, </w:t>
+            </w:r>
+            <w:r>
+              <w:rPr>
+                <w:rFonts w:ascii="Consolas" w:hAnsi="Consolas" w:cs="Consolas" w:eastAsia="Consolas"/>
+                <w:color w:val="1F3B57"/>
+                <w:sz w:val="14"/>
+                <w:szCs w:val="14"/>
+                <w:shd w:val="clear" w:color="auto" w:fill="F3F5F8"/>
+              </w:rPr>
+              <w:t xml:space="preserve">migration.*</w:t>
+            </w:r>
+            <w:r>
+              <w:rPr>
+                <w:rFonts w:ascii="Segoe UI" w:hAnsi="Segoe UI" w:cs="Segoe UI" w:eastAsia="Segoe UI"/>
+                <w:sz w:val="16"/>
+                <w:szCs w:val="16"/>
+              </w:rPr>
+              <w:t xml:space="preserve">)</w:t>
+            </w:r>
+          </w:p>
+        </w:tc>
+        <w:tc>
+          <w:tcPr>
+            <w:tcW w:w="5950" w:type="dxa"/>
+          </w:tcPr>
+          <w:p>
+            <w:pPr>
+              <w:spacing w:before="40" w:after="40" w:line="240" w:lineRule="auto"/>
+            </w:pPr>
+            <w:r>
+              <w:rPr>
+                <w:rFonts w:ascii="Segoe UI" w:hAnsi="Segoe UI" w:cs="Segoe UI" w:eastAsia="Segoe UI"/>
+                <w:sz w:val="16"/>
+                <w:szCs w:val="16"/>
+              </w:rPr>
+              <w:t xml:space="preserve">Changed only on the Go-Live tab (cutover date: </w:t>
+            </w:r>
+            <w:r>
+              <w:rPr>
+                <w:rFonts w:ascii="Consolas" w:hAnsi="Consolas" w:cs="Consolas" w:eastAsia="Consolas"/>
+                <w:color w:val="1F3B57"/>
+                <w:sz w:val="14"/>
+                <w:szCs w:val="14"/>
+                <w:shd w:val="clear" w:color="auto" w:fill="F3F5F8"/>
+              </w:rPr>
+              <w:t xml:space="preserve">write:data-load</w:t>
+            </w:r>
+            <w:r>
+              <w:rPr>
+                <w:rFonts w:ascii="Segoe UI" w:hAnsi="Segoe UI" w:cs="Segoe UI" w:eastAsia="Segoe UI"/>
+                <w:sz w:val="16"/>
+                <w:szCs w:val="16"/>
+              </w:rPr>
+              <w:t xml:space="preserve">; settings: </w:t>
+            </w:r>
+            <w:r>
+              <w:rPr>
+                <w:rFonts w:ascii="Consolas" w:hAnsi="Consolas" w:cs="Consolas" w:eastAsia="Consolas"/>
+                <w:color w:val="1F3B57"/>
+                <w:sz w:val="14"/>
+                <w:szCs w:val="14"/>
+                <w:shd w:val="clear" w:color="auto" w:fill="F3F5F8"/>
+              </w:rPr>
+              <w:t xml:space="preserve">approve:data-load</w:t>
+            </w:r>
+            <w:r>
+              <w:rPr>
+                <w:rFonts w:ascii="Segoe UI" w:hAnsi="Segoe UI" w:cs="Segoe UI" w:eastAsia="Segoe UI"/>
+                <w:sz w:val="16"/>
+                <w:szCs w:val="16"/>
+              </w:rPr>
+              <w:t xml:space="preserve">), with before and after values; never by the Settings sheet or Master &gt; Configuration</w:t>
             </w:r>
           </w:p>
         </w:tc>
@@ -33236,65 +33523,127 @@
         </w:trPr>
         <w:tc>
           <w:tcPr>
-            <w:tcW w:w="2782" w:type="dxa"/>
-          </w:tcPr>
-          <w:p>
-            <w:pPr>
-              <w:spacing w:before="40" w:after="40" w:line="240" w:lineRule="auto"/>
-            </w:pPr>
-            <w:r>
-              <w:rPr>
-                <w:rFonts w:ascii="Segoe UI" w:hAnsi="Segoe UI" w:cs="Segoe UI" w:eastAsia="Segoe UI"/>
-                <w:sz w:val="16"/>
-                <w:szCs w:val="16"/>
-              </w:rPr>
-              <w:t xml:space="preserve">Production load</w:t>
-            </w:r>
-          </w:p>
-        </w:tc>
-        <w:tc>
-          <w:tcPr>
-            <w:tcW w:w="2965" w:type="dxa"/>
-          </w:tcPr>
-          <w:p>
-            <w:pPr>
-              <w:spacing w:before="40" w:after="40" w:line="240" w:lineRule="auto"/>
-            </w:pPr>
-            <w:r>
-              <w:rPr>
-                <w:rFonts w:ascii="Segoe UI" w:hAnsi="Segoe UI" w:cs="Segoe UI" w:eastAsia="Segoe UI"/>
-                <w:sz w:val="16"/>
-                <w:szCs w:val="16"/>
-              </w:rPr>
-              <w:t xml:space="preserve">Load entry, actor</w:t>
-            </w:r>
-          </w:p>
-        </w:tc>
-        <w:tc>
-          <w:tcPr>
-            <w:tcW w:w="3280" w:type="dxa"/>
-          </w:tcPr>
-          <w:p>
-            <w:pPr>
-              <w:spacing w:before="40" w:after="40" w:line="240" w:lineRule="auto"/>
-            </w:pPr>
-            <w:r>
-              <w:rPr>
-                <w:rFonts w:ascii="Segoe UI" w:hAnsi="Segoe UI" w:cs="Segoe UI" w:eastAsia="Segoe UI"/>
-                <w:b/>
-                <w:bCs/>
-                <w:sz w:val="16"/>
-                <w:szCs w:val="16"/>
-              </w:rPr>
-              <w:t xml:space="preserve">No maker-checker on a migration load.</w:t>
-            </w:r>
-            <w:r>
-              <w:rPr>
-                <w:rFonts w:ascii="Segoe UI" w:hAnsi="Segoe UI" w:cs="Segoe UI" w:eastAsia="Segoe UI"/>
-                <w:sz w:val="16"/>
-                <w:szCs w:val="16"/>
-              </w:rPr>
-              <w:t xml:space="preserve"> Compensation: witness at CO-5; reconciliation signed by others than the loader</w:t>
+            <w:tcW w:w="3077" w:type="dxa"/>
+          </w:tcPr>
+          <w:p>
+            <w:pPr>
+              <w:spacing w:before="40" w:after="40" w:line="240" w:lineRule="auto"/>
+            </w:pPr>
+            <w:r>
+              <w:rPr>
+                <w:rFonts w:ascii="Segoe UI" w:hAnsi="Segoe UI" w:cs="Segoe UI" w:eastAsia="Segoe UI"/>
+                <w:sz w:val="16"/>
+                <w:szCs w:val="16"/>
+              </w:rPr>
+              <w:t xml:space="preserve">Go-live lock and unlock</w:t>
+            </w:r>
+          </w:p>
+        </w:tc>
+        <w:tc>
+          <w:tcPr>
+            <w:tcW w:w="5950" w:type="dxa"/>
+          </w:tcPr>
+          <w:p>
+            <w:pPr>
+              <w:spacing w:before="40" w:after="40" w:line="240" w:lineRule="auto"/>
+            </w:pPr>
+            <w:r>
+              <w:rPr>
+                <w:rFonts w:ascii="Segoe UI" w:hAnsi="Segoe UI" w:cs="Segoe UI" w:eastAsia="Segoe UI"/>
+                <w:sz w:val="16"/>
+                <w:szCs w:val="16"/>
+              </w:rPr>
+              <w:t xml:space="preserve">Requested by one user and approved by another (</w:t>
+            </w:r>
+            <w:r>
+              <w:rPr>
+                <w:rFonts w:ascii="Consolas" w:hAnsi="Consolas" w:cs="Consolas" w:eastAsia="Consolas"/>
+                <w:color w:val="1F3B57"/>
+                <w:sz w:val="14"/>
+                <w:szCs w:val="14"/>
+                <w:shd w:val="clear" w:color="auto" w:fill="F3F5F8"/>
+              </w:rPr>
+              <w:t xml:space="preserve">go_live_lock</w:t>
+            </w:r>
+            <w:r>
+              <w:rPr>
+                <w:rFonts w:ascii="Segoe UI" w:hAnsi="Segoe UI" w:cs="Segoe UI" w:eastAsia="Segoe UI"/>
+                <w:sz w:val="16"/>
+                <w:szCs w:val="16"/>
+              </w:rPr>
+              <w:t xml:space="preserve"> </w:t>
+            </w:r>
+            <w:r>
+              <w:rPr>
+                <w:rFonts w:ascii="Consolas" w:hAnsi="Consolas" w:cs="Consolas" w:eastAsia="Consolas"/>
+                <w:color w:val="1F3B57"/>
+                <w:sz w:val="14"/>
+                <w:szCs w:val="14"/>
+                <w:shd w:val="clear" w:color="auto" w:fill="F3F5F8"/>
+              </w:rPr>
+              <w:t xml:space="preserve">request</w:t>
+            </w:r>
+            <w:r>
+              <w:rPr>
+                <w:rFonts w:ascii="Segoe UI" w:hAnsi="Segoe UI" w:cs="Segoe UI" w:eastAsia="Segoe UI"/>
+                <w:sz w:val="16"/>
+                <w:szCs w:val="16"/>
+              </w:rPr>
+              <w:t xml:space="preserve">, </w:t>
+            </w:r>
+            <w:r>
+              <w:rPr>
+                <w:rFonts w:ascii="Consolas" w:hAnsi="Consolas" w:cs="Consolas" w:eastAsia="Consolas"/>
+                <w:color w:val="1F3B57"/>
+                <w:sz w:val="14"/>
+                <w:szCs w:val="14"/>
+                <w:shd w:val="clear" w:color="auto" w:fill="F3F5F8"/>
+              </w:rPr>
+              <w:t xml:space="preserve">approve</w:t>
+            </w:r>
+            <w:r>
+              <w:rPr>
+                <w:rFonts w:ascii="Segoe UI" w:hAnsi="Segoe UI" w:cs="Segoe UI" w:eastAsia="Segoe UI"/>
+                <w:sz w:val="16"/>
+                <w:szCs w:val="16"/>
+              </w:rPr>
+              <w:t xml:space="preserve">, </w:t>
+            </w:r>
+            <w:r>
+              <w:rPr>
+                <w:rFonts w:ascii="Consolas" w:hAnsi="Consolas" w:cs="Consolas" w:eastAsia="Consolas"/>
+                <w:color w:val="1F3B57"/>
+                <w:sz w:val="14"/>
+                <w:szCs w:val="14"/>
+                <w:shd w:val="clear" w:color="auto" w:fill="F3F5F8"/>
+              </w:rPr>
+              <w:t xml:space="preserve">reject</w:t>
+            </w:r>
+            <w:r>
+              <w:rPr>
+                <w:rFonts w:ascii="Segoe UI" w:hAnsi="Segoe UI" w:cs="Segoe UI" w:eastAsia="Segoe UI"/>
+                <w:sz w:val="16"/>
+                <w:szCs w:val="16"/>
+              </w:rPr>
+              <w:t xml:space="preserve">); the lock needs a Go decision, a signed reconciliation and no load waiting. An unlock names the imports it reopens and relocks itself after its hours (</w:t>
+            </w:r>
+            <w:r>
+              <w:rPr>
+                <w:rFonts w:ascii="Consolas" w:hAnsi="Consolas" w:cs="Consolas" w:eastAsia="Consolas"/>
+                <w:color w:val="1F3B57"/>
+                <w:sz w:val="14"/>
+                <w:szCs w:val="14"/>
+                <w:shd w:val="clear" w:color="auto" w:fill="F3F5F8"/>
+              </w:rPr>
+              <w:t xml:space="preserve">relock</w:t>
+            </w:r>
+            <w:r>
+              <w:rPr>
+                <w:rFonts w:ascii="Segoe UI" w:hAnsi="Segoe UI" w:cs="Segoe UI" w:eastAsia="Segoe UI"/>
+                <w:sz w:val="16"/>
+                <w:szCs w:val="16"/>
+              </w:rPr>
+              <w:t xml:space="preserve">)</w:t>
             </w:r>
           </w:p>
         </w:tc>
@@ -33305,55 +33654,73 @@
         </w:trPr>
         <w:tc>
           <w:tcPr>
-            <w:tcW w:w="2782" w:type="dxa"/>
-          </w:tcPr>
-          <w:p>
-            <w:pPr>
-              <w:spacing w:before="40" w:after="40" w:line="240" w:lineRule="auto"/>
-            </w:pPr>
-            <w:r>
-              <w:rPr>
-                <w:rFonts w:ascii="Segoe UI" w:hAnsi="Segoe UI" w:cs="Segoe UI" w:eastAsia="Segoe UI"/>
-                <w:sz w:val="16"/>
-                <w:szCs w:val="16"/>
-              </w:rPr>
-              <w:t xml:space="preserve">Single-object go-live imports after go-live</w:t>
-            </w:r>
-          </w:p>
-        </w:tc>
-        <w:tc>
-          <w:tcPr>
-            <w:tcW w:w="2965" w:type="dxa"/>
-          </w:tcPr>
-          <w:p>
-            <w:pPr>
-              <w:spacing w:before="40" w:after="40" w:line="240" w:lineRule="auto"/>
-            </w:pPr>
-            <w:r>
-              <w:rPr>
-                <w:rFonts w:ascii="Segoe UI" w:hAnsi="Segoe UI" w:cs="Segoe UI" w:eastAsia="Segoe UI"/>
-                <w:sz w:val="16"/>
-                <w:szCs w:val="16"/>
-              </w:rPr>
-              <w:t xml:space="preserve">One entry per policy, or one per opening-balance import</w:t>
-            </w:r>
-          </w:p>
-        </w:tc>
-        <w:tc>
-          <w:tcPr>
-            <w:tcW w:w="3280" w:type="dxa"/>
-          </w:tcPr>
-          <w:p>
-            <w:pPr>
-              <w:spacing w:before="40" w:after="40" w:line="240" w:lineRule="auto"/>
-            </w:pPr>
-            <w:r>
-              <w:rPr>
-                <w:rFonts w:ascii="Segoe UI" w:hAnsi="Segoe UI" w:cs="Segoe UI" w:eastAsia="Segoe UI"/>
-                <w:sz w:val="16"/>
-                <w:szCs w:val="16"/>
-              </w:rPr>
-              <w:t xml:space="preserve">Not blocked by the go-live lock (section 5.4). Compensation: written agreement of the Finance Head; weekly review</w:t>
+            <w:tcW w:w="3077" w:type="dxa"/>
+          </w:tcPr>
+          <w:p>
+            <w:pPr>
+              <w:spacing w:before="40" w:after="40" w:line="240" w:lineRule="auto"/>
+            </w:pPr>
+            <w:r>
+              <w:rPr>
+                <w:rFonts w:ascii="Segoe UI" w:hAnsi="Segoe UI" w:cs="Segoe UI" w:eastAsia="Segoe UI"/>
+                <w:sz w:val="16"/>
+                <w:szCs w:val="16"/>
+              </w:rPr>
+              <w:t xml:space="preserve">Imports of legacy business</w:t>
+            </w:r>
+          </w:p>
+        </w:tc>
+        <w:tc>
+          <w:tcPr>
+            <w:tcW w:w="5950" w:type="dxa"/>
+          </w:tcPr>
+          <w:p>
+            <w:pPr>
+              <w:spacing w:before="40" w:after="40" w:line="240" w:lineRule="auto"/>
+            </w:pPr>
+            <w:r>
+              <w:rPr>
+                <w:rFonts w:ascii="Segoe UI" w:hAnsi="Segoe UI" w:cs="Segoe UI" w:eastAsia="Segoe UI"/>
+                <w:sz w:val="16"/>
+                <w:szCs w:val="16"/>
+              </w:rPr>
+              <w:t xml:space="preserve">Every migration import is under the lock and needs </w:t>
+            </w:r>
+            <w:r>
+              <w:rPr>
+                <w:rFonts w:ascii="Consolas" w:hAnsi="Consolas" w:cs="Consolas" w:eastAsia="Consolas"/>
+                <w:color w:val="1F3B57"/>
+                <w:sz w:val="14"/>
+                <w:szCs w:val="14"/>
+                <w:shd w:val="clear" w:color="auto" w:fill="F3F5F8"/>
+              </w:rPr>
+              <w:t xml:space="preserve">write:data-load</w:t>
+            </w:r>
+            <w:r>
+              <w:rPr>
+                <w:rFonts w:ascii="Segoe UI" w:hAnsi="Segoe UI" w:cs="Segoe UI" w:eastAsia="Segoe UI"/>
+                <w:sz w:val="16"/>
+                <w:szCs w:val="16"/>
+              </w:rPr>
+              <w:t xml:space="preserve">: the migration workbook, the policies go-live upload, the open items import, the opening balances import, legacy-dated rows of the ordinary policy bulk upload, the transaction reset and undo. A refused attempt is audited (</w:t>
+            </w:r>
+            <w:r>
+              <w:rPr>
+                <w:rFonts w:ascii="Consolas" w:hAnsi="Consolas" w:cs="Consolas" w:eastAsia="Consolas"/>
+                <w:color w:val="1F3B57"/>
+                <w:sz w:val="14"/>
+                <w:szCs w:val="14"/>
+                <w:shd w:val="clear" w:color="auto" w:fill="F3F5F8"/>
+              </w:rPr>
+              <w:t xml:space="preserve">refused-locked</w:t>
+            </w:r>
+            <w:r>
+              <w:rPr>
+                <w:rFonts w:ascii="Segoe UI" w:hAnsi="Segoe UI" w:cs="Segoe UI" w:eastAsia="Segoe UI"/>
+                <w:sz w:val="16"/>
+                <w:szCs w:val="16"/>
+              </w:rPr>
+              <w:t xml:space="preserve">)</w:t>
             </w:r>
           </w:p>
         </w:tc>
@@ -33364,55 +33731,178 @@
         </w:trPr>
         <w:tc>
           <w:tcPr>
-            <w:tcW w:w="2782" w:type="dxa"/>
-          </w:tcPr>
-          <w:p>
-            <w:pPr>
-              <w:spacing w:before="40" w:after="40" w:line="240" w:lineRule="auto"/>
-            </w:pPr>
-            <w:r>
-              <w:rPr>
-                <w:rFonts w:ascii="Segoe UI" w:hAnsi="Segoe UI" w:cs="Segoe UI" w:eastAsia="Segoe UI"/>
-                <w:sz w:val="16"/>
-                <w:szCs w:val="16"/>
-              </w:rPr>
-              <w:t xml:space="preserve">Corrections to migrated records after go-live</w:t>
-            </w:r>
-          </w:p>
-        </w:tc>
-        <w:tc>
-          <w:tcPr>
-            <w:tcW w:w="2965" w:type="dxa"/>
-          </w:tcPr>
-          <w:p>
-            <w:pPr>
-              <w:spacing w:before="40" w:after="40" w:line="240" w:lineRule="auto"/>
-            </w:pPr>
-            <w:r>
-              <w:rPr>
-                <w:rFonts w:ascii="Segoe UI" w:hAnsi="Segoe UI" w:cs="Segoe UI" w:eastAsia="Segoe UI"/>
-                <w:sz w:val="16"/>
-                <w:szCs w:val="16"/>
-              </w:rPr>
-              <w:t xml:space="preserve">Normal audit of each screen, with before and after values</w:t>
-            </w:r>
-          </w:p>
-        </w:tc>
-        <w:tc>
-          <w:tcPr>
-            <w:tcW w:w="3280" w:type="dxa"/>
-          </w:tcPr>
-          <w:p>
-            <w:pPr>
-              <w:spacing w:before="40" w:after="40" w:line="240" w:lineRule="auto"/>
-            </w:pPr>
-            <w:r>
-              <w:rPr>
-                <w:rFonts w:ascii="Segoe UI" w:hAnsi="Segoe UI" w:cs="Segoe UI" w:eastAsia="Segoe UI"/>
-                <w:sz w:val="16"/>
-                <w:szCs w:val="16"/>
-              </w:rPr>
-              <w:t xml:space="preserve">None</w:t>
+            <w:tcW w:w="3077" w:type="dxa"/>
+          </w:tcPr>
+          <w:p>
+            <w:pPr>
+              <w:spacing w:before="40" w:after="40" w:line="240" w:lineRule="auto"/>
+            </w:pPr>
+            <w:r>
+              <w:rPr>
+                <w:rFonts w:ascii="Segoe UI" w:hAnsi="Segoe UI" w:cs="Segoe UI" w:eastAsia="Segoe UI"/>
+                <w:sz w:val="16"/>
+                <w:szCs w:val="16"/>
+              </w:rPr>
+              <w:t xml:space="preserve">Reconciliation</w:t>
+            </w:r>
+          </w:p>
+        </w:tc>
+        <w:tc>
+          <w:tcPr>
+            <w:tcW w:w="5950" w:type="dxa"/>
+          </w:tcPr>
+          <w:p>
+            <w:pPr>
+              <w:spacing w:before="40" w:after="40" w:line="240" w:lineRule="auto"/>
+            </w:pPr>
+            <w:r>
+              <w:rPr>
+                <w:rFonts w:ascii="Segoe UI" w:hAnsi="Segoe UI" w:cs="Segoe UI" w:eastAsia="Segoe UI"/>
+                <w:sz w:val="16"/>
+                <w:szCs w:val="16"/>
+              </w:rPr>
+              <w:t xml:space="preserve">Legacy figures, tolerances, explanations, acceptance and signatures audited; acceptance and signing refused to anyone who uploaded, submitted or approved one of its loads; the first signature freezes it</w:t>
+            </w:r>
+          </w:p>
+        </w:tc>
+      </w:tr>
+      <w:tr>
+        <w:trPr>
+          <w:cantSplit/>
+        </w:trPr>
+        <w:tc>
+          <w:tcPr>
+            <w:tcW w:w="3077" w:type="dxa"/>
+          </w:tcPr>
+          <w:p>
+            <w:pPr>
+              <w:spacing w:before="40" w:after="40" w:line="240" w:lineRule="auto"/>
+            </w:pPr>
+            <w:r>
+              <w:rPr>
+                <w:rFonts w:ascii="Segoe UI" w:hAnsi="Segoe UI" w:cs="Segoe UI" w:eastAsia="Segoe UI"/>
+                <w:sz w:val="16"/>
+                <w:szCs w:val="16"/>
+              </w:rPr>
+              <w:t xml:space="preserve">Go / No-Go</w:t>
+            </w:r>
+          </w:p>
+        </w:tc>
+        <w:tc>
+          <w:tcPr>
+            <w:tcW w:w="5950" w:type="dxa"/>
+          </w:tcPr>
+          <w:p>
+            <w:pPr>
+              <w:spacing w:before="40" w:after="40" w:line="240" w:lineRule="auto"/>
+            </w:pPr>
+            <w:r>
+              <w:rPr>
+                <w:rFonts w:ascii="Segoe UI" w:hAnsi="Segoe UI" w:cs="Segoe UI" w:eastAsia="Segoe UI"/>
+                <w:sz w:val="16"/>
+                <w:szCs w:val="16"/>
+              </w:rPr>
+              <w:t xml:space="preserve">Criteria results, waivers (refused on G2 to G5), votes of the named approvers with remarks</w:t>
+            </w:r>
+          </w:p>
+        </w:tc>
+      </w:tr>
+      <w:tr>
+        <w:trPr>
+          <w:cantSplit/>
+        </w:trPr>
+        <w:tc>
+          <w:tcPr>
+            <w:tcW w:w="3077" w:type="dxa"/>
+          </w:tcPr>
+          <w:p>
+            <w:pPr>
+              <w:spacing w:before="40" w:after="40" w:line="240" w:lineRule="auto"/>
+            </w:pPr>
+            <w:r>
+              <w:rPr>
+                <w:rFonts w:ascii="Segoe UI" w:hAnsi="Segoe UI" w:cs="Segoe UI" w:eastAsia="Segoe UI"/>
+                <w:sz w:val="16"/>
+                <w:szCs w:val="16"/>
+              </w:rPr>
+              <w:t xml:space="preserve">Business after go-live on migrated records</w:t>
+            </w:r>
+          </w:p>
+        </w:tc>
+        <w:tc>
+          <w:tcPr>
+            <w:tcW w:w="5950" w:type="dxa"/>
+          </w:tcPr>
+          <w:p>
+            <w:pPr>
+              <w:spacing w:before="40" w:after="40" w:line="240" w:lineRule="auto"/>
+            </w:pPr>
+            <w:r>
+              <w:rPr>
+                <w:rFonts w:ascii="Segoe UI" w:hAnsi="Segoe UI" w:cs="Segoe UI" w:eastAsia="Segoe UI"/>
+                <w:sz w:val="16"/>
+                <w:szCs w:val="16"/>
+              </w:rPr>
+              <w:t xml:space="preserve">Endorsements, claims, receipts and renewals on a migrated policy are issued business, flagged with the policy's origin and legacy number on screen. Edits to migrated records are audited like any record; their origin, legacy number and load cannot be changed</w:t>
+            </w:r>
+          </w:p>
+        </w:tc>
+      </w:tr>
+      <w:tr>
+        <w:trPr>
+          <w:cantSplit/>
+        </w:trPr>
+        <w:tc>
+          <w:tcPr>
+            <w:tcW w:w="3077" w:type="dxa"/>
+          </w:tcPr>
+          <w:p>
+            <w:pPr>
+              <w:spacing w:before="40" w:after="40" w:line="240" w:lineRule="auto"/>
+            </w:pPr>
+            <w:r>
+              <w:rPr>
+                <w:rFonts w:ascii="Segoe UI" w:hAnsi="Segoe UI" w:cs="Segoe UI" w:eastAsia="Segoe UI"/>
+                <w:sz w:val="16"/>
+                <w:szCs w:val="16"/>
+              </w:rPr>
+              <w:t xml:space="preserve">Downloads of migration data</w:t>
+            </w:r>
+          </w:p>
+        </w:tc>
+        <w:tc>
+          <w:tcPr>
+            <w:tcW w:w="5950" w:type="dxa"/>
+          </w:tcPr>
+          <w:p>
+            <w:pPr>
+              <w:spacing w:before="40" w:after="40" w:line="240" w:lineRule="auto"/>
+            </w:pPr>
+            <w:r>
+              <w:rPr>
+                <w:rFonts w:ascii="Segoe UI" w:hAnsi="Segoe UI" w:cs="Segoe UI" w:eastAsia="Segoe UI"/>
+                <w:sz w:val="16"/>
+                <w:szCs w:val="16"/>
+              </w:rPr>
+              <w:t xml:space="preserve">Personal data masked for users without </w:t>
+            </w:r>
+            <w:r>
+              <w:rPr>
+                <w:rFonts w:ascii="Consolas" w:hAnsi="Consolas" w:cs="Consolas" w:eastAsia="Consolas"/>
+                <w:color w:val="1F3B57"/>
+                <w:sz w:val="14"/>
+                <w:szCs w:val="14"/>
+                <w:shd w:val="clear" w:color="auto" w:fill="F3F5F8"/>
+              </w:rPr>
+              <w:t xml:space="preserve">view:pii</w:t>
+            </w:r>
+            <w:r>
+              <w:rPr>
+                <w:rFonts w:ascii="Segoe UI" w:hAnsi="Segoe UI" w:cs="Segoe UI" w:eastAsia="Segoe UI"/>
+                <w:sz w:val="16"/>
+                <w:szCs w:val="16"/>
+              </w:rPr>
+              <w:t xml:space="preserve">; downloads of current data, uploaded files and evidence packs audited</w:t>
             </w:r>
           </w:p>
         </w:tc>
@@ -33434,21 +33924,91 @@
         <w:rPr>
           <w:rFonts w:ascii="Segoe UI" w:hAnsi="Segoe UI" w:cs="Segoe UI" w:eastAsia="Segoe UI"/>
         </w:rPr>
-        <w:t xml:space="preserve">Building second-person approval of migration loads and of the go-live lock, and blocking the single-object go-live imports under the lock, are </w:t>
+        <w:t xml:space="preserve">How migrated and issued business are told apart on the screens (chip </w:t>
       </w:r>
       <w:r>
         <w:rPr>
           <w:rFonts w:ascii="Segoe UI" w:hAnsi="Segoe UI" w:cs="Segoe UI" w:eastAsia="Segoe UI"/>
-          <w:b/>
-          <w:bCs/>
-        </w:rPr>
-        <w:t xml:space="preserve">Not built</w:t>
+          <w:i/>
+          <w:iCs/>
+        </w:rPr>
+        <w:t xml:space="preserve">Migrated</w:t>
       </w:r>
       <w:r>
         <w:rPr>
           <w:rFonts w:ascii="Segoe UI" w:hAnsi="Segoe UI" w:cs="Segoe UI" w:eastAsia="Segoe UI"/>
         </w:rPr>
-        <w:t xml:space="preserve"> and have no work package (Q17). Per-record audit entries are part of the master-data engine of work package MU-A for masters only (M-01); nothing comparable is planned for the migration kit.</w:t>
+        <w:t xml:space="preserve"> with the legacy number and the load, </w:t>
+      </w:r>
+      <w:r>
+        <w:rPr>
+          <w:rFonts w:ascii="Segoe UI" w:hAnsi="Segoe UI" w:cs="Segoe UI" w:eastAsia="Segoe UI"/>
+          <w:i/>
+          <w:iCs/>
+        </w:rPr>
+        <w:t xml:space="preserve">Migrated policy</w:t>
+      </w:r>
+      <w:r>
+        <w:rPr>
+          <w:rFonts w:ascii="Segoe UI" w:hAnsi="Segoe UI" w:cs="Segoe UI" w:eastAsia="Segoe UI"/>
+        </w:rPr>
+        <w:t xml:space="preserve"> on endorsements and claims, </w:t>
+      </w:r>
+      <w:r>
+        <w:rPr>
+          <w:rFonts w:ascii="Segoe UI" w:hAnsi="Segoe UI" w:cs="Segoe UI" w:eastAsia="Segoe UI"/>
+          <w:i/>
+          <w:iCs/>
+        </w:rPr>
+        <w:t xml:space="preserve">Renewal of legacy policy</w:t>
+      </w:r>
+      <w:r>
+        <w:rPr>
+          <w:rFonts w:ascii="Segoe UI" w:hAnsi="Segoe UI" w:cs="Segoe UI" w:eastAsia="Segoe UI"/>
+        </w:rPr>
+        <w:t xml:space="preserve">, Origin filters on the lists and reports, dashboards opening on </w:t>
+      </w:r>
+      <w:r>
+        <w:rPr>
+          <w:rFonts w:ascii="Segoe UI" w:hAnsi="Segoe UI" w:cs="Segoe UI" w:eastAsia="Segoe UI"/>
+          <w:i/>
+          <w:iCs/>
+        </w:rPr>
+        <w:t xml:space="preserve">Issued since go-live</w:t>
+      </w:r>
+      <w:r>
+        <w:rPr>
+          <w:rFonts w:ascii="Segoe UI" w:hAnsi="Segoe UI" w:cs="Segoe UI" w:eastAsia="Segoe UI"/>
+        </w:rPr>
+        <w:t xml:space="preserve">) is described in the workspace guide (</w:t>
+      </w:r>
+      <w:r>
+        <w:rPr>
+          <w:rFonts w:ascii="Consolas" w:hAnsi="Consolas" w:cs="Consolas" w:eastAsia="Consolas"/>
+          <w:color w:val="1F3B57"/>
+          <w:shd w:val="clear" w:color="auto" w:fill="F3F5F8"/>
+        </w:rPr>
+        <w:t xml:space="preserve">GO_LIVE_DATA_WORKBENCH.md</w:t>
+      </w:r>
+      <w:r>
+        <w:rPr>
+          <w:rFonts w:ascii="Segoe UI" w:hAnsi="Segoe UI" w:cs="Segoe UI" w:eastAsia="Segoe UI"/>
+        </w:rPr>
+        <w:t xml:space="preserve">, section </w:t>
+      </w:r>
+      <w:r>
+        <w:rPr>
+          <w:rFonts w:ascii="Segoe UI" w:hAnsi="Segoe UI" w:cs="Segoe UI" w:eastAsia="Segoe UI"/>
+          <w:i/>
+          <w:iCs/>
+        </w:rPr>
+        <w:t xml:space="preserve">Migrated and issued on the screens</w:t>
+      </w:r>
+      <w:r>
+        <w:rPr>
+          <w:rFonts w:ascii="Segoe UI" w:hAnsi="Segoe UI" w:cs="Segoe UI" w:eastAsia="Segoe UI"/>
+        </w:rPr>
+        <w:t xml:space="preserve">).</w:t>
       </w:r>
     </w:p>
     <w:p xmlns:a="http://schemas.openxmlformats.org/drawingml/2006/main" xmlns:pic="http://schemas.openxmlformats.org/drawingml/2006/picture">
@@ -34132,7 +34692,7 @@
         <w:rPr>
           <w:rFonts w:ascii="Segoe UI" w:hAnsi="Segoe UI" w:cs="Segoe UI" w:eastAsia="Segoe UI"/>
         </w:rPr>
-        <w:t xml:space="preserve">Not built and without a work package: product-wise migration templates and a document file-naming convention (Q3); TISPH-specific policy attributes on the Policies sheet (Q4); bulk migration of legacy documents (Q3); a screen for the migration kit (Q15); a documented Azure procedure for the transaction reset (Q16); second-person approval of migration loads and of the go-live lock, per-record audit of migration loads, and blocking of the single-object go-live imports under the go-live lock (Q17).</w:t>
+        <w:t xml:space="preserve">Built since the baseline (Data Migration &amp; Go-Live workspace, section 20): product-wise policy sheets and the document file-naming convention with its checker (Q3), TISPH policy attributes on the product sheets (Q4), the workspace screens (Q15), second-person approval of loads, per-record audit, the two-person go-live lock over every migration import (Q17). Not built and without a work package: bulk migration of legacy documents (Q3); a documented Azure procedure for the transaction reset (Q16).</w:t>
       </w:r>
     </w:p>
     <w:p xmlns:a="http://schemas.openxmlformats.org/drawingml/2006/main" xmlns:pic="http://schemas.openxmlformats.org/drawingml/2006/picture">
@@ -35774,7 +36334,7 @@
                 <w:sz w:val="16"/>
                 <w:szCs w:val="16"/>
               </w:rPr>
-              <w:t xml:space="preserve">Is a screen wanted for the migration kit, or is the API operated by the System Administrator with iorta TechNXT sufficient for a one-time migration?</w:t>
+              <w:t xml:space="preserve">Screen for the migration kit: built as Master &gt; System Configuration &gt; Data Migration &amp; Go-Live (section 20). Remaining for TISPH: who operates it in each mock run</w:t>
             </w:r>
             <w:r>
               <w:rPr>
@@ -35980,25 +36540,7 @@
                 <w:sz w:val="16"/>
                 <w:szCs w:val="16"/>
               </w:rPr>
-              <w:t xml:space="preserve">Controls: does TISPH accept the compensating procedures of section 20.1, or require as a change request second-person approval of migration loads and of the go-live lock, and the single-object go-live imports blocked once </w:t>
-            </w:r>
-            <w:r>
-              <w:rPr>
-                <w:rFonts w:ascii="Consolas" w:hAnsi="Consolas" w:cs="Consolas" w:eastAsia="Consolas"/>
-                <w:color w:val="1F3B57"/>
-                <w:sz w:val="14"/>
-                <w:szCs w:val="14"/>
-                <w:shd w:val="clear" w:color="auto" w:fill="F3F5F8"/>
-              </w:rPr>
-              <w:t xml:space="preserve">golive.locked</w:t>
-            </w:r>
-            <w:r>
-              <w:rPr>
-                <w:rFonts w:ascii="Segoe UI" w:hAnsi="Segoe UI" w:cs="Segoe UI" w:eastAsia="Segoe UI"/>
-                <w:sz w:val="16"/>
-                <w:szCs w:val="16"/>
-              </w:rPr>
-              <w:t xml:space="preserve"> is on?</w:t>
+              <w:t xml:space="preserve">Controls: built in the Data Migration &amp; Go-Live workspace (section 20.1): second-person approval of every load and undo, per-record audit with before and after values, the two-person go-live lock over every migration import including the single-object imports. Remaining for TISPH: confirm the default grants (read and write for TIS IT AppSupport; approve for Finance, Operations Unit Head and General Manager; read-only TIS Auditor), the unlock window (7 days, 4 hours per unlock) and whether undo stays open up to the lock or ends at the reconciliation sign-off</w:t>
             </w:r>
             <w:r>
               <w:rPr>

</xml_diff>

<commit_message>
Point the TISPH pack at the TISPH documents instead of the retired generic ones
NFR A3.1 cites the performance test method, now in section 3 of the TISPH
test strategy. Operations 15.1, A3.5 and A3.10 cite the Environments and
Release document and the remaining contract templates; the support procedure
gap is closed and the known limitations of the retired deploy/README.md
become L15 and L16 of section 17. Solution Architecture, Delivery Governance,
Data Migration and the Document Register cite section 17, the TISPH manual
role chapters and the TISPH sections that replace the RAID log, training
plan and role decks. Environments and Release and Solution Architecture 12.2
record that TISPH DEV runs on Railway until Azure is provisioned. Each
changed document carries a Document Control line of 11 October 2026; the
TISPH docs index matches what remains.

Co-Authored-By: Claude Opus 5.5 <noreply@anthropic.com>
Claude-Session: https://claude.ai/code/session_01VKNMX59m598zKXcFetnd5X
</commit_message>
<xml_diff>
--- a/docs/TISPH/pack/TISPH_Data_Migration_and_Cutover.docx
+++ b/docs/TISPH/pack/TISPH_Data_Migration_and_Cutover.docx
@@ -3633,6 +3633,119 @@
           </w:p>
         </w:tc>
       </w:tr>
+      <w:tr>
+        <w:trPr>
+          <w:cantSplit/>
+        </w:trPr>
+        <w:tc>
+          <w:tcPr>
+            <w:tcW w:w="1197" w:type="dxa"/>
+          </w:tcPr>
+          <w:p>
+            <w:pPr>
+              <w:spacing w:before="40" w:after="40" w:line="240" w:lineRule="auto"/>
+            </w:pPr>
+            <w:r>
+              <w:rPr>
+                <w:rFonts w:ascii="Segoe UI" w:hAnsi="Segoe UI" w:cs="Segoe UI" w:eastAsia="Segoe UI"/>
+                <w:sz w:val="16"/>
+                <w:szCs w:val="16"/>
+              </w:rPr>
+              <w:t xml:space="preserve">11 October 2026</w:t>
+            </w:r>
+          </w:p>
+        </w:tc>
+        <w:tc>
+          <w:tcPr>
+            <w:tcW w:w="829" w:type="dxa"/>
+          </w:tcPr>
+          <w:p>
+            <w:pPr>
+              <w:spacing w:before="40" w:after="40" w:line="240" w:lineRule="auto"/>
+            </w:pPr>
+            <w:r>
+              <w:rPr>
+                <w:rFonts w:ascii="Segoe UI" w:hAnsi="Segoe UI" w:cs="Segoe UI" w:eastAsia="Segoe UI"/>
+                <w:sz w:val="16"/>
+                <w:szCs w:val="16"/>
+              </w:rPr>
+              <w:t xml:space="preserve">0.10 Draft</w:t>
+            </w:r>
+          </w:p>
+        </w:tc>
+        <w:tc>
+          <w:tcPr>
+            <w:tcW w:w="1381" w:type="dxa"/>
+          </w:tcPr>
+          <w:p>
+            <w:pPr>
+              <w:spacing w:before="40" w:after="40" w:line="240" w:lineRule="auto"/>
+            </w:pPr>
+            <w:r>
+              <w:rPr>
+                <w:rFonts w:ascii="Segoe UI" w:hAnsi="Segoe UI" w:cs="Segoe UI" w:eastAsia="Segoe UI"/>
+                <w:sz w:val="16"/>
+                <w:szCs w:val="16"/>
+              </w:rPr>
+              <w:t xml:space="preserve">iorta TechNXT</w:t>
+            </w:r>
+          </w:p>
+        </w:tc>
+        <w:tc>
+          <w:tcPr>
+            <w:tcW w:w="1565" w:type="dxa"/>
+          </w:tcPr>
+          <w:p>
+            <w:pPr>
+              <w:spacing w:before="40" w:after="40" w:line="240" w:lineRule="auto"/>
+            </w:pPr>
+            <w:r>
+              <w:rPr>
+                <w:rFonts w:ascii="Segoe UI" w:hAnsi="Segoe UI" w:cs="Segoe UI" w:eastAsia="Segoe UI"/>
+                <w:sz w:val="16"/>
+                <w:szCs w:val="16"/>
+              </w:rPr>
+              <w:t xml:space="preserve">As above</w:t>
+            </w:r>
+          </w:p>
+        </w:tc>
+        <w:tc>
+          <w:tcPr>
+            <w:tcW w:w="1381" w:type="dxa"/>
+          </w:tcPr>
+          <w:p>
+            <w:pPr>
+              <w:spacing w:before="40" w:after="40" w:line="240" w:lineRule="auto"/>
+            </w:pPr>
+            <w:r>
+              <w:rPr>
+                <w:rFonts w:ascii="Segoe UI" w:hAnsi="Segoe UI" w:cs="Segoe UI" w:eastAsia="Segoe UI"/>
+                <w:sz w:val="16"/>
+                <w:szCs w:val="16"/>
+              </w:rPr>
+              <w:t xml:space="preserve">As above</w:t>
+            </w:r>
+          </w:p>
+        </w:tc>
+        <w:tc>
+          <w:tcPr>
+            <w:tcW w:w="2674" w:type="dxa"/>
+          </w:tcPr>
+          <w:p>
+            <w:pPr>
+              <w:spacing w:before="40" w:after="40" w:line="240" w:lineRule="auto"/>
+            </w:pPr>
+            <w:r>
+              <w:rPr>
+                <w:rFonts w:ascii="Segoe UI" w:hAnsi="Segoe UI" w:cs="Segoe UI" w:eastAsia="Segoe UI"/>
+                <w:sz w:val="16"/>
+                <w:szCs w:val="16"/>
+              </w:rPr>
+              <w:t xml:space="preserve">Documentation cleanup: Appendix A cites the go-live set-up and reset procedures and the Azure runbook instead of the retired deploy/README.md sections 6 to 8.</w:t>
+            </w:r>
+          </w:p>
+        </w:tc>
+      </w:tr>
     </w:tbl>
     <w:p xmlns:a="http://schemas.openxmlformats.org/drawingml/2006/main" xmlns:pic="http://schemas.openxmlformats.org/drawingml/2006/picture">
       <w:pPr>
@@ -40839,15 +40952,15 @@
                 <w:szCs w:val="14"/>
                 <w:shd w:val="clear" w:color="auto" w:fill="F3F5F8"/>
               </w:rPr>
-              <w:t xml:space="preserve">deploy/README.md</w:t>
-            </w:r>
-            <w:r>
-              <w:rPr>
-                <w:rFonts w:ascii="Segoe UI" w:hAnsi="Segoe UI" w:cs="Segoe UI" w:eastAsia="Segoe UI"/>
-                <w:sz w:val="16"/>
-                <w:szCs w:val="16"/>
-              </w:rPr>
-              <w:t xml:space="preserve"> sections 6 to 8; </w:t>
+              <w:t xml:space="preserve">docs/onboarding/GO_LIVE_DATA_SETUP.md; docs/onboarding/SMOKE_TEST_AND_RESET.md (sample data purge); deploy/AZURE.md (rollback); </w:t>
+            </w:r>
+            <w:r>
+              <w:rPr>
+                <w:rFonts w:ascii="Segoe UI" w:hAnsi="Segoe UI" w:cs="Segoe UI" w:eastAsia="Segoe UI"/>
+                <w:sz w:val="16"/>
+                <w:szCs w:val="16"/>
+              </w:rPr>
+              <w:t xml:space="preserve"/>
             </w:r>
             <w:r>
               <w:rPr>

</xml_diff>